<commit_message>
docs: streamline updates summary document to clean issue-focused format
</commit_message>
<xml_diff>
--- a/E_Campus_System_Updates_Summary.docx
+++ b/E_Campus_System_Updates_Summary.docx
@@ -4,368 +4,43 @@
   <w:body>
     <w:p>
       <w:pPr>
-        <w:spacing w:before="0" w:after="80"/>
+        <w:spacing w:before="0" w:after="40"/>
       </w:pPr>
       <w:r>
         <w:rPr>
           <w:rFonts w:ascii="Calibri" w:hAnsi="Calibri"/>
           <w:b/>
           <w:color w:val="1E3A8A"/>
-          <w:sz w:val="44"/>
+          <w:sz w:val="40"/>
         </w:rPr>
-        <w:t>E-CAMPUS PLATFORM</w:t>
+        <w:t>E-Campus Platform — Issue Fixes Summary</w:t>
       </w:r>
     </w:p>
     <w:p>
       <w:pPr>
-        <w:spacing w:before="0" w:after="280"/>
+        <w:spacing w:before="0" w:after="240"/>
       </w:pPr>
       <w:r>
         <w:rPr>
           <w:rFonts w:ascii="Calibri" w:hAnsi="Calibri"/>
-          <w:b/>
-          <w:color w:val="4F46E5"/>
-          <w:sz w:val="28"/>
+          <w:color w:val="64748B"/>
+          <w:sz w:val="22"/>
         </w:rPr>
-        <w:t>System Updates &amp; Technical Resolution Document</w:t>
+        <w:t>Clean Technical Summary of Resolved Issues | September 2026</w:t>
       </w:r>
-    </w:p>
-    <w:tbl>
-      <w:tblPr>
-        <w:tblW w:type="auto" w:w="0"/>
-        <w:jc w:val="center"/>
-        <w:tblLayout w:type="fixed"/>
-        <w:tblLook w:firstColumn="1" w:firstRow="1" w:lastColumn="0" w:lastRow="0" w:noHBand="0" w:noVBand="1" w:val="04A0"/>
-      </w:tblPr>
-      <w:tblGrid>
-        <w:gridCol w:w="4968"/>
-        <w:gridCol w:w="4968"/>
-      </w:tblGrid>
-      <w:tr>
-        <w:tc>
-          <w:tcPr>
-            <w:tcW w:type="dxa" w:w="4896"/>
-            <w:shd w:fill="312E81"/>
-            <w:tcMar>
-              <w:top w:w="120" w:type="dxa"/>
-              <w:bottom w:w="120" w:type="dxa"/>
-              <w:left w:w="140" w:type="dxa"/>
-              <w:right w:w="140" w:type="dxa"/>
-            </w:tcMar>
-            <w:tcBorders>
-              <w:top w:val="single" w:sz="4" w:space="0" w:color="E2E8F0"/>
-              <w:left w:val="single" w:sz="4" w:space="0" w:color="E2E8F0"/>
-              <w:bottom w:val="single" w:sz="4" w:space="0" w:color="E2E8F0"/>
-              <w:right w:val="single" w:sz="4" w:space="0" w:color="E2E8F0"/>
-            </w:tcBorders>
-          </w:tcPr>
-          <w:p>
-            <w:pPr>
-              <w:spacing w:before="40" w:after="40"/>
-              <w:jc w:val="left"/>
-            </w:pPr>
-            <w:r>
-              <w:rPr>
-                <w:rFonts w:ascii="Calibri" w:hAnsi="Calibri"/>
-                <w:b/>
-                <w:color w:val="FFFFFF"/>
-                <w:sz w:val="20"/>
-              </w:rPr>
-              <w:t>Document Reference</w:t>
-            </w:r>
-          </w:p>
-        </w:tc>
-        <w:tc>
-          <w:tcPr>
-            <w:tcW w:type="dxa" w:w="4896"/>
-            <w:shd w:fill="312E81"/>
-            <w:tcMar>
-              <w:top w:w="120" w:type="dxa"/>
-              <w:bottom w:w="120" w:type="dxa"/>
-              <w:left w:w="140" w:type="dxa"/>
-              <w:right w:w="140" w:type="dxa"/>
-            </w:tcMar>
-            <w:tcBorders>
-              <w:top w:val="single" w:sz="4" w:space="0" w:color="E2E8F0"/>
-              <w:left w:val="single" w:sz="4" w:space="0" w:color="E2E8F0"/>
-              <w:bottom w:val="single" w:sz="4" w:space="0" w:color="E2E8F0"/>
-              <w:right w:val="single" w:sz="4" w:space="0" w:color="E2E8F0"/>
-            </w:tcBorders>
-          </w:tcPr>
-          <w:p>
-            <w:pPr>
-              <w:spacing w:before="40" w:after="40"/>
-              <w:jc w:val="left"/>
-            </w:pPr>
-            <w:r>
-              <w:rPr>
-                <w:rFonts w:ascii="Calibri" w:hAnsi="Calibri"/>
-                <w:b/>
-                <w:color w:val="FFFFFF"/>
-                <w:sz w:val="20"/>
-              </w:rPr>
-              <w:t>Release Date</w:t>
-            </w:r>
-          </w:p>
-        </w:tc>
-      </w:tr>
-      <w:tr>
-        <w:tc>
-          <w:tcPr>
-            <w:tcW w:type="dxa" w:w="4896"/>
-            <w:shd w:fill="FFFFFF"/>
-            <w:tcMar>
-              <w:top w:w="100" w:type="dxa"/>
-              <w:bottom w:w="100" w:type="dxa"/>
-              <w:left w:w="140" w:type="dxa"/>
-              <w:right w:w="140" w:type="dxa"/>
-            </w:tcMar>
-            <w:tcBorders>
-              <w:top w:val="single" w:sz="4" w:space="0" w:color="E2E8F0"/>
-              <w:left w:val="single" w:sz="4" w:space="0" w:color="E2E8F0"/>
-              <w:bottom w:val="single" w:sz="4" w:space="0" w:color="E2E8F0"/>
-              <w:right w:val="single" w:sz="4" w:space="0" w:color="E2E8F0"/>
-            </w:tcBorders>
-          </w:tcPr>
-          <w:p>
-            <w:pPr>
-              <w:spacing w:before="40" w:after="40"/>
-              <w:jc w:val="left"/>
-            </w:pPr>
-            <w:r>
-              <w:rPr>
-                <w:rFonts w:ascii="Calibri" w:hAnsi="Calibri"/>
-                <w:color w:val="1E293B"/>
-                <w:sz w:val="19"/>
-              </w:rPr>
-              <w:t>EC-SYS-UPD-2026-09</w:t>
-            </w:r>
-          </w:p>
-        </w:tc>
-        <w:tc>
-          <w:tcPr>
-            <w:tcW w:type="dxa" w:w="4896"/>
-            <w:shd w:fill="FFFFFF"/>
-            <w:tcMar>
-              <w:top w:w="100" w:type="dxa"/>
-              <w:bottom w:w="100" w:type="dxa"/>
-              <w:left w:w="140" w:type="dxa"/>
-              <w:right w:w="140" w:type="dxa"/>
-            </w:tcMar>
-            <w:tcBorders>
-              <w:top w:val="single" w:sz="4" w:space="0" w:color="E2E8F0"/>
-              <w:left w:val="single" w:sz="4" w:space="0" w:color="E2E8F0"/>
-              <w:bottom w:val="single" w:sz="4" w:space="0" w:color="E2E8F0"/>
-              <w:right w:val="single" w:sz="4" w:space="0" w:color="E2E8F0"/>
-            </w:tcBorders>
-          </w:tcPr>
-          <w:p>
-            <w:pPr>
-              <w:spacing w:before="40" w:after="40"/>
-              <w:jc w:val="left"/>
-            </w:pPr>
-            <w:r>
-              <w:rPr>
-                <w:rFonts w:ascii="Calibri" w:hAnsi="Calibri"/>
-                <w:color w:val="1E293B"/>
-                <w:sz w:val="19"/>
-              </w:rPr>
-              <w:t>September 15, 2026</w:t>
-            </w:r>
-          </w:p>
-        </w:tc>
-      </w:tr>
-      <w:tr>
-        <w:tc>
-          <w:tcPr>
-            <w:tcW w:type="dxa" w:w="4896"/>
-            <w:shd w:fill="F8FAFC"/>
-            <w:tcMar>
-              <w:top w:w="100" w:type="dxa"/>
-              <w:bottom w:w="100" w:type="dxa"/>
-              <w:left w:w="140" w:type="dxa"/>
-              <w:right w:w="140" w:type="dxa"/>
-            </w:tcMar>
-            <w:tcBorders>
-              <w:top w:val="single" w:sz="4" w:space="0" w:color="E2E8F0"/>
-              <w:left w:val="single" w:sz="4" w:space="0" w:color="E2E8F0"/>
-              <w:bottom w:val="single" w:sz="4" w:space="0" w:color="E2E8F0"/>
-              <w:right w:val="single" w:sz="4" w:space="0" w:color="E2E8F0"/>
-            </w:tcBorders>
-          </w:tcPr>
-          <w:p>
-            <w:pPr>
-              <w:spacing w:before="40" w:after="40"/>
-              <w:jc w:val="left"/>
-            </w:pPr>
-            <w:r>
-              <w:rPr>
-                <w:rFonts w:ascii="Calibri" w:hAnsi="Calibri"/>
-                <w:color w:val="1E293B"/>
-                <w:sz w:val="19"/>
-              </w:rPr>
-              <w:t>Target Modules</w:t>
-            </w:r>
-          </w:p>
-        </w:tc>
-        <w:tc>
-          <w:tcPr>
-            <w:tcW w:type="dxa" w:w="4896"/>
-            <w:shd w:fill="F8FAFC"/>
-            <w:tcMar>
-              <w:top w:w="100" w:type="dxa"/>
-              <w:bottom w:w="100" w:type="dxa"/>
-              <w:left w:w="140" w:type="dxa"/>
-              <w:right w:w="140" w:type="dxa"/>
-            </w:tcMar>
-            <w:tcBorders>
-              <w:top w:val="single" w:sz="4" w:space="0" w:color="E2E8F0"/>
-              <w:left w:val="single" w:sz="4" w:space="0" w:color="E2E8F0"/>
-              <w:bottom w:val="single" w:sz="4" w:space="0" w:color="E2E8F0"/>
-              <w:right w:val="single" w:sz="4" w:space="0" w:color="E2E8F0"/>
-            </w:tcBorders>
-          </w:tcPr>
-          <w:p>
-            <w:pPr>
-              <w:spacing w:before="40" w:after="40"/>
-              <w:jc w:val="left"/>
-            </w:pPr>
-            <w:r>
-              <w:rPr>
-                <w:rFonts w:ascii="Calibri" w:hAnsi="Calibri"/>
-                <w:color w:val="1E293B"/>
-                <w:sz w:val="19"/>
-              </w:rPr>
-              <w:t>Attendance Permission &amp; Academic Subject Groups</w:t>
-            </w:r>
-          </w:p>
-        </w:tc>
-      </w:tr>
-    </w:tbl>
-    <w:p>
-      <w:pPr>
-        <w:spacing w:before="160" w:after="160"/>
-      </w:pPr>
     </w:p>
     <w:p>
       <w:pPr>
-        <w:spacing w:before="200" w:after="80"/>
+        <w:spacing w:before="160" w:after="80"/>
       </w:pPr>
       <w:r>
         <w:rPr>
           <w:rFonts w:ascii="Calibri" w:hAnsi="Calibri"/>
           <w:b/>
           <w:color w:val="1E3A8A"/>
-          <w:sz w:val="28"/>
+          <w:sz w:val="26"/>
         </w:rPr>
-        <w:t>1. Executive Summary</w:t>
-      </w:r>
-    </w:p>
-    <w:p>
-      <w:pPr>
-        <w:spacing w:before="40" w:after="120"/>
-      </w:pPr>
-      <w:r>
-        <w:t>This release note explains two important updates deployed to the E-Campus platform. Both issues have been diagnosed, resolved at the root cause, and verified across both local and cloud databases.</w:t>
-      </w:r>
-    </w:p>
-    <w:tbl>
-      <w:tblPr>
-        <w:tblW w:type="auto" w:w="0"/>
-        <w:jc w:val="center"/>
-        <w:tblLayout w:type="fixed"/>
-        <w:tblLook w:firstColumn="1" w:firstRow="1" w:lastColumn="0" w:lastRow="0" w:noHBand="0" w:noVBand="1" w:val="04A0"/>
-      </w:tblPr>
-      <w:tblGrid>
-        <w:gridCol w:w="9792"/>
-      </w:tblGrid>
-      <w:tr>
-        <w:tc>
-          <w:tcPr>
-            <w:tcW w:type="dxa" w:w="9936"/>
-            <w:shd w:fill="EEF2FF"/>
-            <w:tcMar>
-              <w:top w:w="120" w:type="dxa"/>
-              <w:bottom w:w="120" w:type="dxa"/>
-              <w:left w:w="180" w:type="dxa"/>
-              <w:right w:w="180" w:type="dxa"/>
-            </w:tcMar>
-            <w:tcBorders>
-              <w:top w:val="none"/>
-              <w:left w:val="single" w:sz="36" w:space="0" w:color="4338CA"/>
-              <w:bottom w:val="none"/>
-              <w:right w:val="none"/>
-            </w:tcBorders>
-          </w:tcPr>
-          <w:p>
-            <w:pPr>
-              <w:spacing w:before="40" w:after="40"/>
-            </w:pPr>
-            <w:r>
-              <w:rPr>
-                <w:rFonts w:ascii="Calibri" w:hAnsi="Calibri"/>
-                <w:b/>
-                <w:color w:val="4338CA"/>
-                <w:sz w:val="21"/>
-              </w:rPr>
-              <w:t xml:space="preserve">[SUMMARY OF CHANGES] </w:t>
-            </w:r>
-            <w:r>
-              <w:rPr>
-                <w:rFonts w:ascii="Calibri" w:hAnsi="Calibri"/>
-                <w:color w:val="1E1B4B"/>
-                <w:sz w:val="20"/>
-              </w:rPr>
-              <w:t>1. Request Edit Permission Fix: Faculty can now successfully submit late attendance edit requests to the Campus Academic Manager (CAM) without encountering staff lookup errors, and CAM approvals immediately unlock the register.</w:t>
-              <w:br/>
-              <w:br/>
-              <w:t>2. Subject Groups API &amp; Display Resolution: All 15 subject groups (Computer Science, Maths / Aptitude, English, Commerce, etc.) are now synced to the cloud database and accessible across all staff dashboards.</w:t>
-            </w:r>
-          </w:p>
-        </w:tc>
-      </w:tr>
-    </w:tbl>
-    <w:p>
-      <w:pPr>
-        <w:spacing w:after="80"/>
-      </w:pPr>
-    </w:p>
-    <w:p>
-      <w:pPr>
-        <w:spacing w:before="280" w:after="80"/>
-      </w:pPr>
-      <w:r>
-        <w:rPr>
-          <w:rFonts w:ascii="Calibri" w:hAnsi="Calibri"/>
-          <w:b/>
-          <w:color w:val="1E3A8A"/>
-          <w:sz w:val="28"/>
-        </w:rPr>
-        <w:t>2. Update 1: Late Attendance 'Request Edit Permission' Fix</w:t>
-      </w:r>
-    </w:p>
-    <w:p>
-      <w:pPr>
-        <w:spacing w:before="80" w:after="40"/>
-      </w:pPr>
-      <w:r>
-        <w:rPr>
-          <w:rFonts w:ascii="Calibri" w:hAnsi="Calibri"/>
-          <w:b/>
-          <w:color w:val="4F46E5"/>
-          <w:sz w:val="22"/>
-        </w:rPr>
-        <w:t>A. What Was the Problem?</w:t>
-      </w:r>
-    </w:p>
-    <w:p>
-      <w:pPr>
-        <w:spacing w:before="40" w:after="120"/>
-      </w:pPr>
-      <w:r>
-        <w:t>When a faculty member tried to submit a late attendance justification in the 'Request Edit Permission' popup (for an expired or locked class period, such as 'Data Analytics Using R'), the form failed with a red error message:</w:t>
-        <w:br/>
-        <w:t>"Invalid parameters. Mentor, Slot or Cover Staff not found."</w:t>
+        <w:t>Issue 1: 'Request Edit Permission' Failed on Locked Attendance</w:t>
       </w:r>
     </w:p>
     <w:tbl>
@@ -386,8 +61,8 @@
             <w:tcMar>
               <w:top w:w="120" w:type="dxa"/>
               <w:bottom w:w="120" w:type="dxa"/>
-              <w:left w:w="180" w:type="dxa"/>
-              <w:right w:w="180" w:type="dxa"/>
+              <w:left w:w="160" w:type="dxa"/>
+              <w:right w:w="160" w:type="dxa"/>
             </w:tcMar>
             <w:tcBorders>
               <w:top w:val="none"/>
@@ -407,7 +82,7 @@
                 <w:color w:val="DC2626"/>
                 <w:sz w:val="21"/>
               </w:rPr>
-              <w:t xml:space="preserve">[ERROR IMPACT] </w:t>
+              <w:t xml:space="preserve">[REPORTED ERROR] </w:t>
             </w:r>
             <w:r>
               <w:rPr>
@@ -415,7 +90,9 @@
                 <w:color w:val="991B1B"/>
                 <w:sz w:val="20"/>
               </w:rPr>
-              <w:t>The error completely blocked faculty members from submitting justifications to their Campus Academic Manager (CAM) when attendance had expired.</w:t>
+              <w:t>Error Encountered: "Invalid parameters. Mentor, Slot or Cover Staff not found."</w:t>
+              <w:br/>
+              <w:t>Screen: Mentor Timetable -&gt; Period Action -&gt; Request Edit Permission modal.</w:t>
             </w:r>
           </w:p>
         </w:tc>
@@ -428,360 +105,194 @@
     </w:p>
     <w:p>
       <w:pPr>
-        <w:spacing w:before="80" w:after="40"/>
+        <w:spacing w:before="40" w:after="80"/>
       </w:pPr>
       <w:r>
         <w:rPr>
-          <w:rFonts w:ascii="Calibri" w:hAnsi="Calibri"/>
           <w:b/>
-          <w:color w:val="4F46E5"/>
-          <w:sz w:val="22"/>
         </w:rPr>
-        <w:t>B. Why Did It Happen? (Root Cause in Plain Words)</w:t>
+        <w:t>What was happening:</w:t>
+      </w:r>
+      <w:r>
+        <w:br/>
+        <w:t>When attendance expired for a scheduled lecture (e.g. 'Data Analytics Using R', BCA, 8:30 AM), the teacher opened the 'Request Edit Permission' popup to ask the Campus Academic Manager (CAM) for permission to mark attendance. Upon clicking 'Submit Request to CAM', the system blocked them with a red error.</w:t>
       </w:r>
     </w:p>
     <w:p>
       <w:pPr>
-        <w:pStyle w:val="ListBullet"/>
-        <w:spacing w:before="20" w:after="40"/>
+        <w:spacing w:before="40" w:after="80"/>
       </w:pPr>
       <w:r>
         <w:rPr>
-          <w:rFonts w:ascii="Calibri" w:hAnsi="Calibri"/>
           <w:b/>
-          <w:sz w:val="20"/>
         </w:rPr>
-        <w:t xml:space="preserve">Misinterpreted Target: </w:t>
+        <w:t>Why it happened (Root Cause):</w:t>
       </w:r>
       <w:r>
-        <w:rPr>
-          <w:rFonts w:ascii="Calibri" w:hAnsi="Calibri"/>
-          <w:sz w:val="20"/>
-        </w:rPr>
-        <w:t>The popup sent a special code ('CAM-APPROVAL') to indicate the request was meant for CAM review. However, the server was looking for an exact lowercase string 'cam_approval' on synthetic punch IDs.</w:t>
+        <w:br/>
+        <w:t>1. The frontend sent the code 'CAM-APPROVAL' as the target recipient.</w:t>
+        <w:br/>
+        <w:t>2. The server didn't recognize 'CAM-APPROVAL' as an admin approval request and mistakenly assumed it was a class handover to another colleague named 'CAM-APPROVAL'.</w:t>
+        <w:br/>
+        <w:t>3. Since no faculty member with ID 'CAM-APPROVAL' exists, the database returned null and rejected the request.</w:t>
       </w:r>
     </w:p>
     <w:p>
       <w:pPr>
-        <w:pStyle w:val="ListBullet"/>
-        <w:spacing w:before="20" w:after="40"/>
+        <w:spacing w:before="40" w:after="160"/>
       </w:pPr>
       <w:r>
         <w:rPr>
-          <w:rFonts w:ascii="Calibri" w:hAnsi="Calibri"/>
           <w:b/>
-          <w:sz w:val="20"/>
         </w:rPr>
-        <w:t xml:space="preserve">Treated as Peer Handover: </w:t>
+        <w:t>What was fixed:</w:t>
       </w:r>
       <w:r>
-        <w:rPr>
-          <w:rFonts w:ascii="Calibri" w:hAnsi="Calibri"/>
-          <w:sz w:val="20"/>
-        </w:rPr>
-        <w:t>Because it didn't match, the system mistook the permission request for a peer handover to another teacher and looked up a mentor named 'CAM-APPROVAL' in the faculty list. Because no such person exists, the database returned null and threw the 404 error.</w:t>
+        <w:br/>
+        <w:t>1. The backend now recognizes all CAM permission requests ('cam_approval', 'CAM-APPROVAL', and 'Late Attendance').</w:t>
+        <w:br/>
+        <w:t>2. It automatically attaches the actual course, class group, and period details from the timetable.</w:t>
+        <w:br/>
+        <w:t>3. When the CAM clicks 'Approve Permission', the status turns to 'Approved' immediately, unlocking the attendance register for the teacher.</w:t>
+        <w:br/>
+        <w:t>4. In CAM Dashboard, the action button now clearly says 'Approve Permission' instead of 'Approve Emergency Colleague Cover'.</w:t>
       </w:r>
     </w:p>
     <w:p>
       <w:pPr>
-        <w:pStyle w:val="ListBullet"/>
-        <w:spacing w:before="20" w:after="40"/>
-      </w:pPr>
-      <w:r>
-        <w:rPr>
-          <w:rFonts w:ascii="Calibri" w:hAnsi="Calibri"/>
-          <w:b/>
-          <w:sz w:val="20"/>
-        </w:rPr>
-        <w:t xml:space="preserve">Approval Routing Mismatch: </w:t>
-      </w:r>
-      <w:r>
-        <w:rPr>
-          <w:rFonts w:ascii="Calibri" w:hAnsi="Calibri"/>
-          <w:sz w:val="20"/>
-        </w:rPr>
-        <w:t>Even if approved, the previous review workflow assumed every emergency request had to be forwarded to a peer faculty member with status 'pending', meaning the session would stay locked forever instead of unlocking.</w:t>
-      </w:r>
-    </w:p>
-    <w:p>
-      <w:pPr>
-        <w:spacing w:before="120" w:after="40"/>
-      </w:pPr>
-      <w:r>
-        <w:rPr>
-          <w:rFonts w:ascii="Calibri" w:hAnsi="Calibri"/>
-          <w:b/>
-          <w:color w:val="4F46E5"/>
-          <w:sz w:val="22"/>
-        </w:rPr>
-        <w:t>C. What Changes Were Made?</w:t>
-      </w:r>
-    </w:p>
-    <w:p>
-      <w:pPr>
-        <w:pStyle w:val="ListBullet"/>
-        <w:spacing w:before="20" w:after="40"/>
-      </w:pPr>
-      <w:r>
-        <w:rPr>
-          <w:rFonts w:ascii="Calibri" w:hAnsi="Calibri"/>
-          <w:b/>
-          <w:sz w:val="20"/>
-        </w:rPr>
-        <w:t xml:space="preserve">Smart Identification: </w:t>
-      </w:r>
-      <w:r>
-        <w:rPr>
-          <w:rFonts w:ascii="Calibri" w:hAnsi="Calibri"/>
-          <w:sz w:val="20"/>
-        </w:rPr>
-        <w:t>The requests API (/api/requests) now recognizes all CAM markers ('cam_approval', 'CAM-APPROVAL', and any request containing 'Late Attendance').</w:t>
-      </w:r>
-    </w:p>
-    <w:p>
-      <w:pPr>
-        <w:pStyle w:val="ListBullet"/>
-        <w:spacing w:before="20" w:after="40"/>
-      </w:pPr>
-      <w:r>
-        <w:rPr>
-          <w:rFonts w:ascii="Calibri" w:hAnsi="Calibri"/>
-          <w:b/>
-          <w:sz w:val="20"/>
-        </w:rPr>
-        <w:t xml:space="preserve">Complete Class Details: </w:t>
-      </w:r>
-      <w:r>
-        <w:rPr>
-          <w:rFonts w:ascii="Calibri" w:hAnsi="Calibri"/>
-          <w:sz w:val="20"/>
-        </w:rPr>
-        <w:t>The backend queries the timetable slot to retain the exact course title, class group, day, and time, ensuring the CAM sees exactly which lecture needs permission.</w:t>
-      </w:r>
-    </w:p>
-    <w:p>
-      <w:pPr>
-        <w:pStyle w:val="ListBullet"/>
-        <w:spacing w:before="20" w:after="40"/>
-      </w:pPr>
-      <w:r>
-        <w:rPr>
-          <w:rFonts w:ascii="Calibri" w:hAnsi="Calibri"/>
-          <w:b/>
-          <w:sz w:val="20"/>
-        </w:rPr>
-        <w:t xml:space="preserve">Direct Unlock Approval: </w:t>
-      </w:r>
-      <w:r>
-        <w:rPr>
-          <w:rFonts w:ascii="Calibri" w:hAnsi="Calibri"/>
-          <w:sz w:val="20"/>
-        </w:rPr>
-        <w:t>When CAM reviews the request and clicks approve, the status transitions directly to 'approved', which instantly clears the lock in the faculty portal.</w:t>
-      </w:r>
-    </w:p>
-    <w:p>
-      <w:pPr>
-        <w:pStyle w:val="ListBullet"/>
-        <w:spacing w:before="20" w:after="40"/>
-      </w:pPr>
-      <w:r>
-        <w:rPr>
-          <w:rFonts w:ascii="Calibri" w:hAnsi="Calibri"/>
-          <w:b/>
-          <w:sz w:val="20"/>
-        </w:rPr>
-        <w:t xml:space="preserve">Intuitive CAM Review Interface: </w:t>
-      </w:r>
-      <w:r>
-        <w:rPr>
-          <w:rFonts w:ascii="Calibri" w:hAnsi="Calibri"/>
-          <w:sz w:val="20"/>
-        </w:rPr>
-        <w:t>The button in the CAM dashboard was updated to display 'Approve Permission' with an explicit confirmation dialog explaining that the teacher will be allowed to mark attendance.</w:t>
-      </w:r>
-    </w:p>
-    <w:p>
-      <w:pPr>
-        <w:spacing w:before="280" w:after="80"/>
+        <w:spacing w:before="200" w:after="80"/>
       </w:pPr>
       <w:r>
         <w:rPr>
           <w:rFonts w:ascii="Calibri" w:hAnsi="Calibri"/>
           <w:b/>
           <w:color w:val="1E3A8A"/>
-          <w:sz w:val="28"/>
+          <w:sz w:val="26"/>
         </w:rPr>
-        <w:t>3. Update 2: Subject Groups API &amp; Display Resolution</w:t>
+        <w:t>Issue 2: Subject Groups Missing in Dropdowns &amp; Dashboards</w:t>
+      </w:r>
+    </w:p>
+    <w:tbl>
+      <w:tblPr>
+        <w:tblW w:type="auto" w:w="0"/>
+        <w:jc w:val="center"/>
+        <w:tblLayout w:type="fixed"/>
+        <w:tblLook w:firstColumn="1" w:firstRow="1" w:lastColumn="0" w:lastRow="0" w:noHBand="0" w:noVBand="1" w:val="04A0"/>
+      </w:tblPr>
+      <w:tblGrid>
+        <w:gridCol w:w="9792"/>
+      </w:tblGrid>
+      <w:tr>
+        <w:tc>
+          <w:tcPr>
+            <w:tcW w:type="dxa" w:w="9936"/>
+            <w:shd w:fill="FFFBEB"/>
+            <w:tcMar>
+              <w:top w:w="120" w:type="dxa"/>
+              <w:bottom w:w="120" w:type="dxa"/>
+              <w:left w:w="160" w:type="dxa"/>
+              <w:right w:w="160" w:type="dxa"/>
+            </w:tcMar>
+            <w:tcBorders>
+              <w:top w:val="none"/>
+              <w:left w:val="single" w:sz="36" w:space="0" w:color="D97706"/>
+              <w:bottom w:val="none"/>
+              <w:right w:val="none"/>
+            </w:tcBorders>
+          </w:tcPr>
+          <w:p>
+            <w:pPr>
+              <w:spacing w:before="40" w:after="40"/>
+            </w:pPr>
+            <w:r>
+              <w:rPr>
+                <w:rFonts w:ascii="Calibri" w:hAnsi="Calibri"/>
+                <w:b/>
+                <w:color w:val="D97706"/>
+                <w:sz w:val="21"/>
+              </w:rPr>
+              <w:t xml:space="preserve">[REPORTED ISSUE] </w:t>
+            </w:r>
+            <w:r>
+              <w:rPr>
+                <w:rFonts w:ascii="Calibri" w:hAnsi="Calibri"/>
+                <w:color w:val="92400E"/>
+                <w:sz w:val="20"/>
+              </w:rPr>
+              <w:t>Reported Issue: Subject groups (Computer Science, Maths / Aptitude, English, Commerce, etc.) were missing or not showing up in dropdowns across the application.</w:t>
+            </w:r>
+          </w:p>
+        </w:tc>
+      </w:tr>
+    </w:tbl>
+    <w:p>
+      <w:pPr>
+        <w:spacing w:after="80"/>
+      </w:pPr>
+    </w:p>
+    <w:p>
+      <w:pPr>
+        <w:spacing w:before="40" w:after="80"/>
+      </w:pPr>
+      <w:r>
+        <w:rPr>
+          <w:b/>
+        </w:rPr>
+        <w:t>What was happening:</w:t>
+      </w:r>
+      <w:r>
+        <w:br/>
+        <w:t>Subject group selection dropdowns (in CAM subject management, mentor profile forms, and admin screens) were empty or missing categories.</w:t>
       </w:r>
     </w:p>
     <w:p>
       <w:pPr>
-        <w:spacing w:before="80" w:after="40"/>
+        <w:spacing w:before="40" w:after="80"/>
       </w:pPr>
       <w:r>
         <w:rPr>
-          <w:rFonts w:ascii="Calibri" w:hAnsi="Calibri"/>
           <w:b/>
-          <w:color w:val="4F46E5"/>
-          <w:sz w:val="22"/>
         </w:rPr>
-        <w:t>A. What Was the Problem?</w:t>
+        <w:t>Why it happened (Root Cause):</w:t>
+      </w:r>
+      <w:r>
+        <w:br/>
+        <w:t>1. In the cloud database (Supabase), the subject_groups table had 0 records because default groups had never been populated during database creation.</w:t>
+        <w:br/>
+        <w:t>2. In the main data API (/api/data), subject groups were only loaded if the user was in 'Demo Allocation' mode. For Mentors, CAMs, and KAMs, it was skipped and returned empty.</w:t>
       </w:r>
     </w:p>
     <w:p>
       <w:pPr>
-        <w:spacing w:before="40" w:after="120"/>
+        <w:spacing w:before="40" w:after="160"/>
       </w:pPr>
       <w:r>
-        <w:t>Subject groups (such as Computer Science, Maths / Aptitude, English / Communication, Commerce, Management, etc.) were not appearing in the dropdown menus or dashboards when editing faculty profiles, creating subjects, or managing departments.</w:t>
+        <w:rPr>
+          <w:b/>
+        </w:rPr>
+        <w:t>What was fixed:</w:t>
+      </w:r>
+      <w:r>
+        <w:br/>
+        <w:t>1. Successfully synchronized all 15 active subject groups directly into the cloud database (Supabase), matching the local environment.</w:t>
+        <w:br/>
+        <w:t>2. Updated /api/data so that all staff members (Mentors, CAMs, Admins, KAMs) receive subject groups automatically upon login.</w:t>
+        <w:br/>
+        <w:t>3. Added automatic self-healing to GET /api/subject-groups: if the table is ever empty on a fresh setup, it auto-seeds standard groups and any existing mentor categories dynamically.</w:t>
       </w:r>
     </w:p>
     <w:p>
       <w:pPr>
-        <w:spacing w:before="80" w:after="40"/>
-      </w:pPr>
-      <w:r>
-        <w:rPr>
-          <w:rFonts w:ascii="Calibri" w:hAnsi="Calibri"/>
-          <w:b/>
-          <w:color w:val="4F46E5"/>
-          <w:sz w:val="22"/>
-        </w:rPr>
-        <w:t>B. Why Did It Happen? (Root Cause in Plain Words)</w:t>
-      </w:r>
-    </w:p>
-    <w:p>
-      <w:pPr>
-        <w:pStyle w:val="ListBullet"/>
-        <w:spacing w:before="20" w:after="40"/>
-      </w:pPr>
-      <w:r>
-        <w:rPr>
-          <w:rFonts w:ascii="Calibri" w:hAnsi="Calibri"/>
-          <w:b/>
-          <w:sz w:val="20"/>
-        </w:rPr>
-        <w:t xml:space="preserve">Role-Restricted Query Filter: </w:t>
-      </w:r>
-      <w:r>
-        <w:rPr>
-          <w:rFonts w:ascii="Calibri" w:hAnsi="Calibri"/>
-          <w:sz w:val="20"/>
-        </w:rPr>
-        <w:t>In /api/data, subject_groups was only included if needsDemo was true (active only for demo allocators and admins). For Mentors, KAMs, and other staff roles, the API returned an empty list.</w:t>
-      </w:r>
-    </w:p>
-    <w:p>
-      <w:pPr>
-        <w:pStyle w:val="ListBullet"/>
-        <w:spacing w:before="20" w:after="40"/>
-      </w:pPr>
-      <w:r>
-        <w:rPr>
-          <w:rFonts w:ascii="Calibri" w:hAnsi="Calibri"/>
-          <w:b/>
-          <w:sz w:val="20"/>
-        </w:rPr>
-        <w:t xml:space="preserve">Empty Cloud Database Table: </w:t>
-      </w:r>
-      <w:r>
-        <w:rPr>
-          <w:rFonts w:ascii="Calibri" w:hAnsi="Calibri"/>
-          <w:sz w:val="20"/>
-        </w:rPr>
-        <w:t>In the Supabase cloud database, the subject_groups table had 0 records because default group records had never been inserted during initial setup, even though mentors and subjects were already categorized under them.</w:t>
-      </w:r>
-    </w:p>
-    <w:p>
-      <w:pPr>
-        <w:spacing w:before="120" w:after="40"/>
-      </w:pPr>
-      <w:r>
-        <w:rPr>
-          <w:rFonts w:ascii="Calibri" w:hAnsi="Calibri"/>
-          <w:b/>
-          <w:color w:val="4F46E5"/>
-          <w:sz w:val="22"/>
-        </w:rPr>
-        <w:t>C. What Changes Were Made?</w:t>
-      </w:r>
-    </w:p>
-    <w:p>
-      <w:pPr>
-        <w:pStyle w:val="ListBullet"/>
-        <w:spacing w:before="20" w:after="40"/>
-      </w:pPr>
-      <w:r>
-        <w:rPr>
-          <w:rFonts w:ascii="Calibri" w:hAnsi="Calibri"/>
-          <w:b/>
-          <w:sz w:val="20"/>
-        </w:rPr>
-        <w:t xml:space="preserve">Cloud Database Populated: </w:t>
-      </w:r>
-      <w:r>
-        <w:rPr>
-          <w:rFonts w:ascii="Calibri" w:hAnsi="Calibri"/>
-          <w:sz w:val="20"/>
-        </w:rPr>
-        <w:t>Synchronized all 15 active subject groups directly into Supabase. Both localhost and cloud databases now have identical, complete catalogs.</w:t>
-      </w:r>
-    </w:p>
-    <w:p>
-      <w:pPr>
-        <w:pStyle w:val="ListBullet"/>
-        <w:spacing w:before="20" w:after="40"/>
-      </w:pPr>
-      <w:r>
-        <w:rPr>
-          <w:rFonts w:ascii="Calibri" w:hAnsi="Calibri"/>
-          <w:b/>
-          <w:sz w:val="20"/>
-        </w:rPr>
-        <w:t xml:space="preserve">Broadened API Access: </w:t>
-      </w:r>
-      <w:r>
-        <w:rPr>
-          <w:rFonts w:ascii="Calibri" w:hAnsi="Calibri"/>
-          <w:sz w:val="20"/>
-        </w:rPr>
-        <w:t>Updated /api/data line 204 to check !isStudent instead of needsDemo, allowing Mentors, CAMs, and Admins full access to subject groups.</w:t>
-      </w:r>
-    </w:p>
-    <w:p>
-      <w:pPr>
-        <w:pStyle w:val="ListBullet"/>
-        <w:spacing w:before="20" w:after="40"/>
-      </w:pPr>
-      <w:r>
-        <w:rPr>
-          <w:rFonts w:ascii="Calibri" w:hAnsi="Calibri"/>
-          <w:b/>
-          <w:sz w:val="20"/>
-        </w:rPr>
-        <w:t xml:space="preserve">Automatic Self-Healing: </w:t>
-      </w:r>
-      <w:r>
-        <w:rPr>
-          <w:rFonts w:ascii="Calibri" w:hAnsi="Calibri"/>
-          <w:sz w:val="20"/>
-        </w:rPr>
-        <w:t>Added automated fallback logic in GET /api/subject-groups: if the table is ever empty on a new deployment, it automatically seeds the 11 standard academic categories plus any existing mentor/subject groups dynamically.</w:t>
-      </w:r>
-    </w:p>
-    <w:p>
-      <w:pPr>
-        <w:spacing w:before="280" w:after="80"/>
+        <w:spacing w:before="200" w:after="80"/>
       </w:pPr>
       <w:r>
         <w:rPr>
           <w:rFonts w:ascii="Calibri" w:hAnsi="Calibri"/>
           <w:b/>
           <w:color w:val="1E3A8A"/>
-          <w:sz w:val="28"/>
+          <w:sz w:val="26"/>
         </w:rPr>
-        <w:t>4. Before vs. After Comparison Table</w:t>
+        <w:t>Summary Table of Fixes</w:t>
       </w:r>
     </w:p>
     <w:tbl>
@@ -800,7 +311,7 @@
       <w:tr>
         <w:tc>
           <w:tcPr>
-            <w:tcW w:type="dxa" w:w="2160"/>
+            <w:tcW w:type="dxa" w:w="2592"/>
             <w:shd w:fill="1E3A8A"/>
             <w:tcMar>
               <w:top w:w="120" w:type="dxa"/>
@@ -860,13 +371,13 @@
                 <w:color w:val="FFFFFF"/>
                 <w:sz w:val="20"/>
               </w:rPr>
-              <w:t>Before Fix</w:t>
+              <w:t>Problem Found</w:t>
             </w:r>
           </w:p>
         </w:tc>
         <w:tc>
           <w:tcPr>
-            <w:tcW w:type="dxa" w:w="2592"/>
+            <w:tcW w:type="dxa" w:w="3168"/>
             <w:shd w:fill="1E3A8A"/>
             <w:tcMar>
               <w:top w:w="120" w:type="dxa"/>
@@ -893,13 +404,13 @@
                 <w:color w:val="FFFFFF"/>
                 <w:sz w:val="20"/>
               </w:rPr>
-              <w:t>After Fix</w:t>
+              <w:t>Solution Applied</w:t>
             </w:r>
           </w:p>
         </w:tc>
         <w:tc>
           <w:tcPr>
-            <w:tcW w:type="dxa" w:w="2448"/>
+            <w:tcW w:type="dxa" w:w="1440"/>
             <w:shd w:fill="1E3A8A"/>
             <w:tcMar>
               <w:top w:w="120" w:type="dxa"/>
@@ -926,7 +437,7 @@
                 <w:color w:val="FFFFFF"/>
                 <w:sz w:val="20"/>
               </w:rPr>
-              <w:t>User Benefit</w:t>
+              <w:t>Status</w:t>
             </w:r>
           </w:p>
         </w:tc>
@@ -934,7 +445,7 @@
       <w:tr>
         <w:tc>
           <w:tcPr>
-            <w:tcW w:type="dxa" w:w="2160"/>
+            <w:tcW w:type="dxa" w:w="2592"/>
             <w:shd w:fill="FFFFFF"/>
             <w:tcMar>
               <w:top w:w="100" w:type="dxa"/>
@@ -960,7 +471,7 @@
                 <w:color w:val="1E293B"/>
                 <w:sz w:val="19"/>
               </w:rPr>
-              <w:t>Late Attendance Request Submission</w:t>
+              <w:t>Late Attendance Edit Permission</w:t>
             </w:r>
           </w:p>
         </w:tc>
@@ -992,13 +503,13 @@
                 <w:color w:val="1E293B"/>
                 <w:sz w:val="19"/>
               </w:rPr>
-              <w:t>Crashed with red error 'Invalid parameters. Mentor, Slot or Cover Staff not found.'</w:t>
+              <w:t>Error: 'Mentor, Slot or Cover Staff not found.' Form could not submit.</w:t>
             </w:r>
           </w:p>
         </w:tc>
         <w:tc>
           <w:tcPr>
-            <w:tcW w:type="dxa" w:w="2592"/>
+            <w:tcW w:type="dxa" w:w="3168"/>
             <w:shd w:fill="FFFFFF"/>
             <w:tcMar>
               <w:top w:w="100" w:type="dxa"/>
@@ -1024,13 +535,13 @@
                 <w:color w:val="1E293B"/>
                 <w:sz w:val="19"/>
               </w:rPr>
-              <w:t>Submits instantly with status 'Pending CAM Approval'.</w:t>
+              <w:t>Recognized CAM target ID, attached class details, and enabled direct 1-click CAM unlock.</w:t>
             </w:r>
           </w:p>
         </w:tc>
         <w:tc>
           <w:tcPr>
-            <w:tcW w:type="dxa" w:w="2448"/>
+            <w:tcW w:type="dxa" w:w="1440"/>
             <w:shd w:fill="FFFFFF"/>
             <w:tcMar>
               <w:top w:w="100" w:type="dxa"/>
@@ -1056,7 +567,7 @@
                 <w:color w:val="1E293B"/>
                 <w:sz w:val="19"/>
               </w:rPr>
-              <w:t>Teachers can smoothly submit justifications after deadlines.</w:t>
+              <w:t>RESOLVED</w:t>
             </w:r>
           </w:p>
         </w:tc>
@@ -1064,7 +575,7 @@
       <w:tr>
         <w:tc>
           <w:tcPr>
-            <w:tcW w:type="dxa" w:w="2160"/>
+            <w:tcW w:type="dxa" w:w="2592"/>
             <w:shd w:fill="F8FAFC"/>
             <w:tcMar>
               <w:top w:w="100" w:type="dxa"/>
@@ -1090,7 +601,7 @@
                 <w:color w:val="1E293B"/>
                 <w:sz w:val="19"/>
               </w:rPr>
-              <w:t>CAM Approval &amp; Attendance Unlock</w:t>
+              <w:t>Subject Groups Catalog</w:t>
             </w:r>
           </w:p>
         </w:tc>
@@ -1122,13 +633,13 @@
                 <w:color w:val="1E293B"/>
                 <w:sz w:val="19"/>
               </w:rPr>
-              <w:t>Requests got stuck in 'pending' waiting for non-existent colleague cover.</w:t>
+              <w:t>Categories missing in dropdowns; 0 rows in cloud DB; gated in API.</w:t>
             </w:r>
           </w:p>
         </w:tc>
         <w:tc>
           <w:tcPr>
-            <w:tcW w:type="dxa" w:w="2592"/>
+            <w:tcW w:type="dxa" w:w="3168"/>
             <w:shd w:fill="F8FAFC"/>
             <w:tcMar>
               <w:top w:w="100" w:type="dxa"/>
@@ -1154,13 +665,13 @@
                 <w:color w:val="1E293B"/>
                 <w:sz w:val="19"/>
               </w:rPr>
-              <w:t>Changes immediately to 'Approved' upon CAM review; register unlocks.</w:t>
+              <w:t>Synced 15 groups to cloud DB, opened API to all staff, added auto-seed self-healing.</w:t>
             </w:r>
           </w:p>
         </w:tc>
         <w:tc>
           <w:tcPr>
-            <w:tcW w:type="dxa" w:w="2448"/>
+            <w:tcW w:type="dxa" w:w="1440"/>
             <w:shd w:fill="F8FAFC"/>
             <w:tcMar>
               <w:top w:w="100" w:type="dxa"/>
@@ -1186,156 +697,12 @@
                 <w:color w:val="1E293B"/>
                 <w:sz w:val="19"/>
               </w:rPr>
-              <w:t>Teachers can immediately mark and submit student attendance.</w:t>
-            </w:r>
-          </w:p>
-        </w:tc>
-      </w:tr>
-      <w:tr>
-        <w:tc>
-          <w:tcPr>
-            <w:tcW w:type="dxa" w:w="2160"/>
-            <w:shd w:fill="FFFFFF"/>
-            <w:tcMar>
-              <w:top w:w="100" w:type="dxa"/>
-              <w:bottom w:w="100" w:type="dxa"/>
-              <w:left w:w="140" w:type="dxa"/>
-              <w:right w:w="140" w:type="dxa"/>
-            </w:tcMar>
-            <w:tcBorders>
-              <w:top w:val="single" w:sz="4" w:space="0" w:color="E2E8F0"/>
-              <w:left w:val="single" w:sz="4" w:space="0" w:color="E2E8F0"/>
-              <w:bottom w:val="single" w:sz="4" w:space="0" w:color="E2E8F0"/>
-              <w:right w:val="single" w:sz="4" w:space="0" w:color="E2E8F0"/>
-            </w:tcBorders>
-          </w:tcPr>
-          <w:p>
-            <w:pPr>
-              <w:spacing w:before="40" w:after="40"/>
-              <w:jc w:val="left"/>
-            </w:pPr>
-            <w:r>
-              <w:rPr>
-                <w:rFonts w:ascii="Calibri" w:hAnsi="Calibri"/>
-                <w:color w:val="1E293B"/>
-                <w:sz w:val="19"/>
-              </w:rPr>
-              <w:t>Subject Groups Visibility</w:t>
-            </w:r>
-          </w:p>
-        </w:tc>
-        <w:tc>
-          <w:tcPr>
-            <w:tcW w:type="dxa" w:w="2592"/>
-            <w:shd w:fill="FFFFFF"/>
-            <w:tcMar>
-              <w:top w:w="100" w:type="dxa"/>
-              <w:bottom w:w="100" w:type="dxa"/>
-              <w:left w:w="140" w:type="dxa"/>
-              <w:right w:w="140" w:type="dxa"/>
-            </w:tcMar>
-            <w:tcBorders>
-              <w:top w:val="single" w:sz="4" w:space="0" w:color="E2E8F0"/>
-              <w:left w:val="single" w:sz="4" w:space="0" w:color="E2E8F0"/>
-              <w:bottom w:val="single" w:sz="4" w:space="0" w:color="E2E8F0"/>
-              <w:right w:val="single" w:sz="4" w:space="0" w:color="E2E8F0"/>
-            </w:tcBorders>
-          </w:tcPr>
-          <w:p>
-            <w:pPr>
-              <w:spacing w:before="40" w:after="40"/>
-              <w:jc w:val="left"/>
-            </w:pPr>
-            <w:r>
-              <w:rPr>
-                <w:rFonts w:ascii="Calibri" w:hAnsi="Calibri"/>
-                <w:color w:val="1E293B"/>
-                <w:sz w:val="19"/>
-              </w:rPr>
-              <w:t>Hidden or empty (0 groups in cloud DB, restricted in data API).</w:t>
-            </w:r>
-          </w:p>
-        </w:tc>
-        <w:tc>
-          <w:tcPr>
-            <w:tcW w:type="dxa" w:w="2592"/>
-            <w:shd w:fill="FFFFFF"/>
-            <w:tcMar>
-              <w:top w:w="100" w:type="dxa"/>
-              <w:bottom w:w="100" w:type="dxa"/>
-              <w:left w:w="140" w:type="dxa"/>
-              <w:right w:w="140" w:type="dxa"/>
-            </w:tcMar>
-            <w:tcBorders>
-              <w:top w:val="single" w:sz="4" w:space="0" w:color="E2E8F0"/>
-              <w:left w:val="single" w:sz="4" w:space="0" w:color="E2E8F0"/>
-              <w:bottom w:val="single" w:sz="4" w:space="0" w:color="E2E8F0"/>
-              <w:right w:val="single" w:sz="4" w:space="0" w:color="E2E8F0"/>
-            </w:tcBorders>
-          </w:tcPr>
-          <w:p>
-            <w:pPr>
-              <w:spacing w:before="40" w:after="40"/>
-              <w:jc w:val="left"/>
-            </w:pPr>
-            <w:r>
-              <w:rPr>
-                <w:rFonts w:ascii="Calibri" w:hAnsi="Calibri"/>
-                <w:color w:val="1E293B"/>
-                <w:sz w:val="19"/>
-              </w:rPr>
-              <w:t>All 15 subject groups synced to DB and visible to all staff.</w:t>
-            </w:r>
-          </w:p>
-        </w:tc>
-        <w:tc>
-          <w:tcPr>
-            <w:tcW w:type="dxa" w:w="2448"/>
-            <w:shd w:fill="FFFFFF"/>
-            <w:tcMar>
-              <w:top w:w="100" w:type="dxa"/>
-              <w:bottom w:w="100" w:type="dxa"/>
-              <w:left w:w="140" w:type="dxa"/>
-              <w:right w:w="140" w:type="dxa"/>
-            </w:tcMar>
-            <w:tcBorders>
-              <w:top w:val="single" w:sz="4" w:space="0" w:color="E2E8F0"/>
-              <w:left w:val="single" w:sz="4" w:space="0" w:color="E2E8F0"/>
-              <w:bottom w:val="single" w:sz="4" w:space="0" w:color="E2E8F0"/>
-              <w:right w:val="single" w:sz="4" w:space="0" w:color="E2E8F0"/>
-            </w:tcBorders>
-          </w:tcPr>
-          <w:p>
-            <w:pPr>
-              <w:spacing w:before="40" w:after="40"/>
-              <w:jc w:val="left"/>
-            </w:pPr>
-            <w:r>
-              <w:rPr>
-                <w:rFonts w:ascii="Calibri" w:hAnsi="Calibri"/>
-                <w:color w:val="1E293B"/>
-                <w:sz w:val="19"/>
-              </w:rPr>
-              <w:t>Full dropdown lists available in mentor and subject management.</w:t>
+              <w:t>RESOLVED</w:t>
             </w:r>
           </w:p>
         </w:tc>
       </w:tr>
     </w:tbl>
-    <w:p>
-      <w:pPr>
-        <w:spacing w:before="280" w:after="80"/>
-      </w:pPr>
-      <w:r>
-        <w:rPr>
-          <w:rFonts w:ascii="Calibri" w:hAnsi="Calibri"/>
-          <w:b/>
-          <w:color w:val="1E3A8A"/>
-          <w:sz w:val="28"/>
-        </w:rPr>
-        <w:t>5. Synced Subject Groups Catalog (15 Groups)</w:t>
-      </w:r>
-    </w:p>
     <w:tbl>
       <w:tblPr>
         <w:tblW w:type="auto" w:w="0"/>
@@ -1344,1577 +711,46 @@
         <w:tblLook w:firstColumn="1" w:firstRow="1" w:lastColumn="0" w:lastRow="0" w:noHBand="0" w:noVBand="1" w:val="04A0"/>
       </w:tblPr>
       <w:tblGrid>
-        <w:gridCol w:w="3312"/>
-        <w:gridCol w:w="3312"/>
-        <w:gridCol w:w="3312"/>
+        <w:gridCol w:w="9792"/>
       </w:tblGrid>
       <w:tr>
         <w:tc>
           <w:tcPr>
-            <w:tcW w:type="dxa" w:w="864"/>
-            <w:shd w:fill="4338CA"/>
+            <w:tcW w:type="dxa" w:w="9936"/>
+            <w:shd w:fill="F0FDF4"/>
             <w:tcMar>
               <w:top w:w="120" w:type="dxa"/>
               <w:bottom w:w="120" w:type="dxa"/>
-              <w:left w:w="140" w:type="dxa"/>
-              <w:right w:w="140" w:type="dxa"/>
+              <w:left w:w="160" w:type="dxa"/>
+              <w:right w:w="160" w:type="dxa"/>
             </w:tcMar>
             <w:tcBorders>
-              <w:top w:val="single" w:sz="4" w:space="0" w:color="E2E8F0"/>
-              <w:left w:val="single" w:sz="4" w:space="0" w:color="E2E8F0"/>
-              <w:bottom w:val="single" w:sz="4" w:space="0" w:color="E2E8F0"/>
-              <w:right w:val="single" w:sz="4" w:space="0" w:color="E2E8F0"/>
+              <w:top w:val="none"/>
+              <w:left w:val="single" w:sz="36" w:space="0" w:color="16A34A"/>
+              <w:bottom w:val="none"/>
+              <w:right w:val="none"/>
             </w:tcBorders>
           </w:tcPr>
           <w:p>
             <w:pPr>
               <w:spacing w:before="40" w:after="40"/>
-              <w:jc w:val="left"/>
             </w:pPr>
             <w:r>
               <w:rPr>
                 <w:rFonts w:ascii="Calibri" w:hAnsi="Calibri"/>
                 <w:b/>
-                <w:color w:val="FFFFFF"/>
-                <w:sz w:val="20"/>
+                <w:color w:val="16A34A"/>
+                <w:sz w:val="21"/>
               </w:rPr>
-              <w:t>#</w:t>
+              <w:t xml:space="preserve">[VERIFICATION COMPLETE] </w:t>
             </w:r>
-          </w:p>
-        </w:tc>
-        <w:tc>
-          <w:tcPr>
-            <w:tcW w:type="dxa" w:w="3744"/>
-            <w:shd w:fill="4338CA"/>
-            <w:tcMar>
-              <w:top w:w="120" w:type="dxa"/>
-              <w:bottom w:w="120" w:type="dxa"/>
-              <w:left w:w="140" w:type="dxa"/>
-              <w:right w:w="140" w:type="dxa"/>
-            </w:tcMar>
-            <w:tcBorders>
-              <w:top w:val="single" w:sz="4" w:space="0" w:color="E2E8F0"/>
-              <w:left w:val="single" w:sz="4" w:space="0" w:color="E2E8F0"/>
-              <w:bottom w:val="single" w:sz="4" w:space="0" w:color="E2E8F0"/>
-              <w:right w:val="single" w:sz="4" w:space="0" w:color="E2E8F0"/>
-            </w:tcBorders>
-          </w:tcPr>
-          <w:p>
-            <w:pPr>
-              <w:spacing w:before="40" w:after="40"/>
-              <w:jc w:val="left"/>
-            </w:pPr>
             <w:r>
               <w:rPr>
                 <w:rFonts w:ascii="Calibri" w:hAnsi="Calibri"/>
-                <w:b/>
-                <w:color w:val="FFFFFF"/>
+                <w:color w:val="166534"/>
                 <w:sz w:val="20"/>
               </w:rPr>
-              <w:t>Group Name</w:t>
-            </w:r>
-          </w:p>
-        </w:tc>
-        <w:tc>
-          <w:tcPr>
-            <w:tcW w:type="dxa" w:w="5184"/>
-            <w:shd w:fill="4338CA"/>
-            <w:tcMar>
-              <w:top w:w="120" w:type="dxa"/>
-              <w:bottom w:w="120" w:type="dxa"/>
-              <w:left w:w="140" w:type="dxa"/>
-              <w:right w:w="140" w:type="dxa"/>
-            </w:tcMar>
-            <w:tcBorders>
-              <w:top w:val="single" w:sz="4" w:space="0" w:color="E2E8F0"/>
-              <w:left w:val="single" w:sz="4" w:space="0" w:color="E2E8F0"/>
-              <w:bottom w:val="single" w:sz="4" w:space="0" w:color="E2E8F0"/>
-              <w:right w:val="single" w:sz="4" w:space="0" w:color="E2E8F0"/>
-            </w:tcBorders>
-          </w:tcPr>
-          <w:p>
-            <w:pPr>
-              <w:spacing w:before="40" w:after="40"/>
-              <w:jc w:val="left"/>
-            </w:pPr>
-            <w:r>
-              <w:rPr>
-                <w:rFonts w:ascii="Calibri" w:hAnsi="Calibri"/>
-                <w:b/>
-                <w:color w:val="FFFFFF"/>
-                <w:sz w:val="20"/>
-              </w:rPr>
-              <w:t>Description / Academic Stream</w:t>
-            </w:r>
-          </w:p>
-        </w:tc>
-      </w:tr>
-      <w:tr>
-        <w:tc>
-          <w:tcPr>
-            <w:tcW w:type="dxa" w:w="864"/>
-            <w:shd w:fill="FFFFFF"/>
-            <w:tcMar>
-              <w:top w:w="100" w:type="dxa"/>
-              <w:bottom w:w="100" w:type="dxa"/>
-              <w:left w:w="140" w:type="dxa"/>
-              <w:right w:w="140" w:type="dxa"/>
-            </w:tcMar>
-            <w:tcBorders>
-              <w:top w:val="single" w:sz="4" w:space="0" w:color="E2E8F0"/>
-              <w:left w:val="single" w:sz="4" w:space="0" w:color="E2E8F0"/>
-              <w:bottom w:val="single" w:sz="4" w:space="0" w:color="E2E8F0"/>
-              <w:right w:val="single" w:sz="4" w:space="0" w:color="E2E8F0"/>
-            </w:tcBorders>
-          </w:tcPr>
-          <w:p>
-            <w:pPr>
-              <w:spacing w:before="40" w:after="40"/>
-              <w:jc w:val="left"/>
-            </w:pPr>
-            <w:r>
-              <w:rPr>
-                <w:rFonts w:ascii="Calibri" w:hAnsi="Calibri"/>
-                <w:color w:val="1E293B"/>
-                <w:sz w:val="19"/>
-              </w:rPr>
-              <w:t>1</w:t>
-            </w:r>
-          </w:p>
-        </w:tc>
-        <w:tc>
-          <w:tcPr>
-            <w:tcW w:type="dxa" w:w="3744"/>
-            <w:shd w:fill="FFFFFF"/>
-            <w:tcMar>
-              <w:top w:w="100" w:type="dxa"/>
-              <w:bottom w:w="100" w:type="dxa"/>
-              <w:left w:w="140" w:type="dxa"/>
-              <w:right w:w="140" w:type="dxa"/>
-            </w:tcMar>
-            <w:tcBorders>
-              <w:top w:val="single" w:sz="4" w:space="0" w:color="E2E8F0"/>
-              <w:left w:val="single" w:sz="4" w:space="0" w:color="E2E8F0"/>
-              <w:bottom w:val="single" w:sz="4" w:space="0" w:color="E2E8F0"/>
-              <w:right w:val="single" w:sz="4" w:space="0" w:color="E2E8F0"/>
-            </w:tcBorders>
-          </w:tcPr>
-          <w:p>
-            <w:pPr>
-              <w:spacing w:before="40" w:after="40"/>
-              <w:jc w:val="left"/>
-            </w:pPr>
-            <w:r>
-              <w:rPr>
-                <w:rFonts w:ascii="Calibri" w:hAnsi="Calibri"/>
-                <w:color w:val="1E293B"/>
-                <w:sz w:val="19"/>
-              </w:rPr>
-              <w:t>Airline and Airport Management</w:t>
-            </w:r>
-          </w:p>
-        </w:tc>
-        <w:tc>
-          <w:tcPr>
-            <w:tcW w:type="dxa" w:w="5184"/>
-            <w:shd w:fill="FFFFFF"/>
-            <w:tcMar>
-              <w:top w:w="100" w:type="dxa"/>
-              <w:bottom w:w="100" w:type="dxa"/>
-              <w:left w:w="140" w:type="dxa"/>
-              <w:right w:w="140" w:type="dxa"/>
-            </w:tcMar>
-            <w:tcBorders>
-              <w:top w:val="single" w:sz="4" w:space="0" w:color="E2E8F0"/>
-              <w:left w:val="single" w:sz="4" w:space="0" w:color="E2E8F0"/>
-              <w:bottom w:val="single" w:sz="4" w:space="0" w:color="E2E8F0"/>
-              <w:right w:val="single" w:sz="4" w:space="0" w:color="E2E8F0"/>
-            </w:tcBorders>
-          </w:tcPr>
-          <w:p>
-            <w:pPr>
-              <w:spacing w:before="40" w:after="40"/>
-              <w:jc w:val="left"/>
-            </w:pPr>
-            <w:r>
-              <w:rPr>
-                <w:rFonts w:ascii="Calibri" w:hAnsi="Calibri"/>
-                <w:color w:val="1E293B"/>
-                <w:sz w:val="19"/>
-              </w:rPr>
-              <w:t>Department of Airline and Airport Management</w:t>
-            </w:r>
-          </w:p>
-        </w:tc>
-      </w:tr>
-      <w:tr>
-        <w:tc>
-          <w:tcPr>
-            <w:tcW w:type="dxa" w:w="864"/>
-            <w:shd w:fill="F8FAFC"/>
-            <w:tcMar>
-              <w:top w:w="100" w:type="dxa"/>
-              <w:bottom w:w="100" w:type="dxa"/>
-              <w:left w:w="140" w:type="dxa"/>
-              <w:right w:w="140" w:type="dxa"/>
-            </w:tcMar>
-            <w:tcBorders>
-              <w:top w:val="single" w:sz="4" w:space="0" w:color="E2E8F0"/>
-              <w:left w:val="single" w:sz="4" w:space="0" w:color="E2E8F0"/>
-              <w:bottom w:val="single" w:sz="4" w:space="0" w:color="E2E8F0"/>
-              <w:right w:val="single" w:sz="4" w:space="0" w:color="E2E8F0"/>
-            </w:tcBorders>
-          </w:tcPr>
-          <w:p>
-            <w:pPr>
-              <w:spacing w:before="40" w:after="40"/>
-              <w:jc w:val="left"/>
-            </w:pPr>
-            <w:r>
-              <w:rPr>
-                <w:rFonts w:ascii="Calibri" w:hAnsi="Calibri"/>
-                <w:color w:val="1E293B"/>
-                <w:sz w:val="19"/>
-              </w:rPr>
-              <w:t>2</w:t>
-            </w:r>
-          </w:p>
-        </w:tc>
-        <w:tc>
-          <w:tcPr>
-            <w:tcW w:type="dxa" w:w="3744"/>
-            <w:shd w:fill="F8FAFC"/>
-            <w:tcMar>
-              <w:top w:w="100" w:type="dxa"/>
-              <w:bottom w:w="100" w:type="dxa"/>
-              <w:left w:w="140" w:type="dxa"/>
-              <w:right w:w="140" w:type="dxa"/>
-            </w:tcMar>
-            <w:tcBorders>
-              <w:top w:val="single" w:sz="4" w:space="0" w:color="E2E8F0"/>
-              <w:left w:val="single" w:sz="4" w:space="0" w:color="E2E8F0"/>
-              <w:bottom w:val="single" w:sz="4" w:space="0" w:color="E2E8F0"/>
-              <w:right w:val="single" w:sz="4" w:space="0" w:color="E2E8F0"/>
-            </w:tcBorders>
-          </w:tcPr>
-          <w:p>
-            <w:pPr>
-              <w:spacing w:before="40" w:after="40"/>
-              <w:jc w:val="left"/>
-            </w:pPr>
-            <w:r>
-              <w:rPr>
-                <w:rFonts w:ascii="Calibri" w:hAnsi="Calibri"/>
-                <w:color w:val="1E293B"/>
-                <w:sz w:val="19"/>
-              </w:rPr>
-              <w:t>Aptitude</w:t>
-            </w:r>
-          </w:p>
-        </w:tc>
-        <w:tc>
-          <w:tcPr>
-            <w:tcW w:type="dxa" w:w="5184"/>
-            <w:shd w:fill="F8FAFC"/>
-            <w:tcMar>
-              <w:top w:w="100" w:type="dxa"/>
-              <w:bottom w:w="100" w:type="dxa"/>
-              <w:left w:w="140" w:type="dxa"/>
-              <w:right w:w="140" w:type="dxa"/>
-            </w:tcMar>
-            <w:tcBorders>
-              <w:top w:val="single" w:sz="4" w:space="0" w:color="E2E8F0"/>
-              <w:left w:val="single" w:sz="4" w:space="0" w:color="E2E8F0"/>
-              <w:bottom w:val="single" w:sz="4" w:space="0" w:color="E2E8F0"/>
-              <w:right w:val="single" w:sz="4" w:space="0" w:color="E2E8F0"/>
-            </w:tcBorders>
-          </w:tcPr>
-          <w:p>
-            <w:pPr>
-              <w:spacing w:before="40" w:after="40"/>
-              <w:jc w:val="left"/>
-            </w:pPr>
-            <w:r>
-              <w:rPr>
-                <w:rFonts w:ascii="Calibri" w:hAnsi="Calibri"/>
-                <w:color w:val="1E293B"/>
-                <w:sz w:val="19"/>
-              </w:rPr>
-              <w:t>Quantitative Aptitude, logical reasoning, and puzzle solving</w:t>
-            </w:r>
-          </w:p>
-        </w:tc>
-      </w:tr>
-      <w:tr>
-        <w:tc>
-          <w:tcPr>
-            <w:tcW w:type="dxa" w:w="864"/>
-            <w:shd w:fill="FFFFFF"/>
-            <w:tcMar>
-              <w:top w:w="100" w:type="dxa"/>
-              <w:bottom w:w="100" w:type="dxa"/>
-              <w:left w:w="140" w:type="dxa"/>
-              <w:right w:w="140" w:type="dxa"/>
-            </w:tcMar>
-            <w:tcBorders>
-              <w:top w:val="single" w:sz="4" w:space="0" w:color="E2E8F0"/>
-              <w:left w:val="single" w:sz="4" w:space="0" w:color="E2E8F0"/>
-              <w:bottom w:val="single" w:sz="4" w:space="0" w:color="E2E8F0"/>
-              <w:right w:val="single" w:sz="4" w:space="0" w:color="E2E8F0"/>
-            </w:tcBorders>
-          </w:tcPr>
-          <w:p>
-            <w:pPr>
-              <w:spacing w:before="40" w:after="40"/>
-              <w:jc w:val="left"/>
-            </w:pPr>
-            <w:r>
-              <w:rPr>
-                <w:rFonts w:ascii="Calibri" w:hAnsi="Calibri"/>
-                <w:color w:val="1E293B"/>
-                <w:sz w:val="19"/>
-              </w:rPr>
-              <w:t>3</w:t>
-            </w:r>
-          </w:p>
-        </w:tc>
-        <w:tc>
-          <w:tcPr>
-            <w:tcW w:type="dxa" w:w="3744"/>
-            <w:shd w:fill="FFFFFF"/>
-            <w:tcMar>
-              <w:top w:w="100" w:type="dxa"/>
-              <w:bottom w:w="100" w:type="dxa"/>
-              <w:left w:w="140" w:type="dxa"/>
-              <w:right w:w="140" w:type="dxa"/>
-            </w:tcMar>
-            <w:tcBorders>
-              <w:top w:val="single" w:sz="4" w:space="0" w:color="E2E8F0"/>
-              <w:left w:val="single" w:sz="4" w:space="0" w:color="E2E8F0"/>
-              <w:bottom w:val="single" w:sz="4" w:space="0" w:color="E2E8F0"/>
-              <w:right w:val="single" w:sz="4" w:space="0" w:color="E2E8F0"/>
-            </w:tcBorders>
-          </w:tcPr>
-          <w:p>
-            <w:pPr>
-              <w:spacing w:before="40" w:after="40"/>
-              <w:jc w:val="left"/>
-            </w:pPr>
-            <w:r>
-              <w:rPr>
-                <w:rFonts w:ascii="Calibri" w:hAnsi="Calibri"/>
-                <w:color w:val="1E293B"/>
-                <w:sz w:val="19"/>
-              </w:rPr>
-              <w:t>Commerce</w:t>
-            </w:r>
-          </w:p>
-        </w:tc>
-        <w:tc>
-          <w:tcPr>
-            <w:tcW w:type="dxa" w:w="5184"/>
-            <w:shd w:fill="FFFFFF"/>
-            <w:tcMar>
-              <w:top w:w="100" w:type="dxa"/>
-              <w:bottom w:w="100" w:type="dxa"/>
-              <w:left w:w="140" w:type="dxa"/>
-              <w:right w:w="140" w:type="dxa"/>
-            </w:tcMar>
-            <w:tcBorders>
-              <w:top w:val="single" w:sz="4" w:space="0" w:color="E2E8F0"/>
-              <w:left w:val="single" w:sz="4" w:space="0" w:color="E2E8F0"/>
-              <w:bottom w:val="single" w:sz="4" w:space="0" w:color="E2E8F0"/>
-              <w:right w:val="single" w:sz="4" w:space="0" w:color="E2E8F0"/>
-            </w:tcBorders>
-          </w:tcPr>
-          <w:p>
-            <w:pPr>
-              <w:spacing w:before="40" w:after="40"/>
-              <w:jc w:val="left"/>
-            </w:pPr>
-            <w:r>
-              <w:rPr>
-                <w:rFonts w:ascii="Calibri" w:hAnsi="Calibri"/>
-                <w:color w:val="1E293B"/>
-                <w:sz w:val="19"/>
-              </w:rPr>
-              <w:t>Department of Commerce, accounting and finance</w:t>
-            </w:r>
-          </w:p>
-        </w:tc>
-      </w:tr>
-      <w:tr>
-        <w:tc>
-          <w:tcPr>
-            <w:tcW w:type="dxa" w:w="864"/>
-            <w:shd w:fill="F8FAFC"/>
-            <w:tcMar>
-              <w:top w:w="100" w:type="dxa"/>
-              <w:bottom w:w="100" w:type="dxa"/>
-              <w:left w:w="140" w:type="dxa"/>
-              <w:right w:w="140" w:type="dxa"/>
-            </w:tcMar>
-            <w:tcBorders>
-              <w:top w:val="single" w:sz="4" w:space="0" w:color="E2E8F0"/>
-              <w:left w:val="single" w:sz="4" w:space="0" w:color="E2E8F0"/>
-              <w:bottom w:val="single" w:sz="4" w:space="0" w:color="E2E8F0"/>
-              <w:right w:val="single" w:sz="4" w:space="0" w:color="E2E8F0"/>
-            </w:tcBorders>
-          </w:tcPr>
-          <w:p>
-            <w:pPr>
-              <w:spacing w:before="40" w:after="40"/>
-              <w:jc w:val="left"/>
-            </w:pPr>
-            <w:r>
-              <w:rPr>
-                <w:rFonts w:ascii="Calibri" w:hAnsi="Calibri"/>
-                <w:color w:val="1E293B"/>
-                <w:sz w:val="19"/>
-              </w:rPr>
-              <w:t>4</w:t>
-            </w:r>
-          </w:p>
-        </w:tc>
-        <w:tc>
-          <w:tcPr>
-            <w:tcW w:type="dxa" w:w="3744"/>
-            <w:shd w:fill="F8FAFC"/>
-            <w:tcMar>
-              <w:top w:w="100" w:type="dxa"/>
-              <w:bottom w:w="100" w:type="dxa"/>
-              <w:left w:w="140" w:type="dxa"/>
-              <w:right w:w="140" w:type="dxa"/>
-            </w:tcMar>
-            <w:tcBorders>
-              <w:top w:val="single" w:sz="4" w:space="0" w:color="E2E8F0"/>
-              <w:left w:val="single" w:sz="4" w:space="0" w:color="E2E8F0"/>
-              <w:bottom w:val="single" w:sz="4" w:space="0" w:color="E2E8F0"/>
-              <w:right w:val="single" w:sz="4" w:space="0" w:color="E2E8F0"/>
-            </w:tcBorders>
-          </w:tcPr>
-          <w:p>
-            <w:pPr>
-              <w:spacing w:before="40" w:after="40"/>
-              <w:jc w:val="left"/>
-            </w:pPr>
-            <w:r>
-              <w:rPr>
-                <w:rFonts w:ascii="Calibri" w:hAnsi="Calibri"/>
-                <w:color w:val="1E293B"/>
-                <w:sz w:val="19"/>
-              </w:rPr>
-              <w:t>Computer Science</w:t>
-            </w:r>
-          </w:p>
-        </w:tc>
-        <w:tc>
-          <w:tcPr>
-            <w:tcW w:type="dxa" w:w="5184"/>
-            <w:shd w:fill="F8FAFC"/>
-            <w:tcMar>
-              <w:top w:w="100" w:type="dxa"/>
-              <w:bottom w:w="100" w:type="dxa"/>
-              <w:left w:w="140" w:type="dxa"/>
-              <w:right w:w="140" w:type="dxa"/>
-            </w:tcMar>
-            <w:tcBorders>
-              <w:top w:val="single" w:sz="4" w:space="0" w:color="E2E8F0"/>
-              <w:left w:val="single" w:sz="4" w:space="0" w:color="E2E8F0"/>
-              <w:bottom w:val="single" w:sz="4" w:space="0" w:color="E2E8F0"/>
-              <w:right w:val="single" w:sz="4" w:space="0" w:color="E2E8F0"/>
-            </w:tcBorders>
-          </w:tcPr>
-          <w:p>
-            <w:pPr>
-              <w:spacing w:before="40" w:after="40"/>
-              <w:jc w:val="left"/>
-            </w:pPr>
-            <w:r>
-              <w:rPr>
-                <w:rFonts w:ascii="Calibri" w:hAnsi="Calibri"/>
-                <w:color w:val="1E293B"/>
-                <w:sz w:val="19"/>
-              </w:rPr>
-              <w:t>Computer Science, programming, algorithms, and IT</w:t>
-            </w:r>
-          </w:p>
-        </w:tc>
-      </w:tr>
-      <w:tr>
-        <w:tc>
-          <w:tcPr>
-            <w:tcW w:type="dxa" w:w="864"/>
-            <w:shd w:fill="FFFFFF"/>
-            <w:tcMar>
-              <w:top w:w="100" w:type="dxa"/>
-              <w:bottom w:w="100" w:type="dxa"/>
-              <w:left w:w="140" w:type="dxa"/>
-              <w:right w:w="140" w:type="dxa"/>
-            </w:tcMar>
-            <w:tcBorders>
-              <w:top w:val="single" w:sz="4" w:space="0" w:color="E2E8F0"/>
-              <w:left w:val="single" w:sz="4" w:space="0" w:color="E2E8F0"/>
-              <w:bottom w:val="single" w:sz="4" w:space="0" w:color="E2E8F0"/>
-              <w:right w:val="single" w:sz="4" w:space="0" w:color="E2E8F0"/>
-            </w:tcBorders>
-          </w:tcPr>
-          <w:p>
-            <w:pPr>
-              <w:spacing w:before="40" w:after="40"/>
-              <w:jc w:val="left"/>
-            </w:pPr>
-            <w:r>
-              <w:rPr>
-                <w:rFonts w:ascii="Calibri" w:hAnsi="Calibri"/>
-                <w:color w:val="1E293B"/>
-                <w:sz w:val="19"/>
-              </w:rPr>
-              <w:t>5</w:t>
-            </w:r>
-          </w:p>
-        </w:tc>
-        <w:tc>
-          <w:tcPr>
-            <w:tcW w:type="dxa" w:w="3744"/>
-            <w:shd w:fill="FFFFFF"/>
-            <w:tcMar>
-              <w:top w:w="100" w:type="dxa"/>
-              <w:bottom w:w="100" w:type="dxa"/>
-              <w:left w:w="140" w:type="dxa"/>
-              <w:right w:w="140" w:type="dxa"/>
-            </w:tcMar>
-            <w:tcBorders>
-              <w:top w:val="single" w:sz="4" w:space="0" w:color="E2E8F0"/>
-              <w:left w:val="single" w:sz="4" w:space="0" w:color="E2E8F0"/>
-              <w:bottom w:val="single" w:sz="4" w:space="0" w:color="E2E8F0"/>
-              <w:right w:val="single" w:sz="4" w:space="0" w:color="E2E8F0"/>
-            </w:tcBorders>
-          </w:tcPr>
-          <w:p>
-            <w:pPr>
-              <w:spacing w:before="40" w:after="40"/>
-              <w:jc w:val="left"/>
-            </w:pPr>
-            <w:r>
-              <w:rPr>
-                <w:rFonts w:ascii="Calibri" w:hAnsi="Calibri"/>
-                <w:color w:val="1E293B"/>
-                <w:sz w:val="19"/>
-              </w:rPr>
-              <w:t>Data Science</w:t>
-            </w:r>
-          </w:p>
-        </w:tc>
-        <w:tc>
-          <w:tcPr>
-            <w:tcW w:type="dxa" w:w="5184"/>
-            <w:shd w:fill="FFFFFF"/>
-            <w:tcMar>
-              <w:top w:w="100" w:type="dxa"/>
-              <w:bottom w:w="100" w:type="dxa"/>
-              <w:left w:w="140" w:type="dxa"/>
-              <w:right w:w="140" w:type="dxa"/>
-            </w:tcMar>
-            <w:tcBorders>
-              <w:top w:val="single" w:sz="4" w:space="0" w:color="E2E8F0"/>
-              <w:left w:val="single" w:sz="4" w:space="0" w:color="E2E8F0"/>
-              <w:bottom w:val="single" w:sz="4" w:space="0" w:color="E2E8F0"/>
-              <w:right w:val="single" w:sz="4" w:space="0" w:color="E2E8F0"/>
-            </w:tcBorders>
-          </w:tcPr>
-          <w:p>
-            <w:pPr>
-              <w:spacing w:before="40" w:after="40"/>
-              <w:jc w:val="left"/>
-            </w:pPr>
-            <w:r>
-              <w:rPr>
-                <w:rFonts w:ascii="Calibri" w:hAnsi="Calibri"/>
-                <w:color w:val="1E293B"/>
-                <w:sz w:val="19"/>
-              </w:rPr>
-              <w:t>Department of Data Science and Analytics</w:t>
-            </w:r>
-          </w:p>
-        </w:tc>
-      </w:tr>
-      <w:tr>
-        <w:tc>
-          <w:tcPr>
-            <w:tcW w:type="dxa" w:w="864"/>
-            <w:shd w:fill="F8FAFC"/>
-            <w:tcMar>
-              <w:top w:w="100" w:type="dxa"/>
-              <w:bottom w:w="100" w:type="dxa"/>
-              <w:left w:w="140" w:type="dxa"/>
-              <w:right w:w="140" w:type="dxa"/>
-            </w:tcMar>
-            <w:tcBorders>
-              <w:top w:val="single" w:sz="4" w:space="0" w:color="E2E8F0"/>
-              <w:left w:val="single" w:sz="4" w:space="0" w:color="E2E8F0"/>
-              <w:bottom w:val="single" w:sz="4" w:space="0" w:color="E2E8F0"/>
-              <w:right w:val="single" w:sz="4" w:space="0" w:color="E2E8F0"/>
-            </w:tcBorders>
-          </w:tcPr>
-          <w:p>
-            <w:pPr>
-              <w:spacing w:before="40" w:after="40"/>
-              <w:jc w:val="left"/>
-            </w:pPr>
-            <w:r>
-              <w:rPr>
-                <w:rFonts w:ascii="Calibri" w:hAnsi="Calibri"/>
-                <w:color w:val="1E293B"/>
-                <w:sz w:val="19"/>
-              </w:rPr>
-              <w:t>6</w:t>
-            </w:r>
-          </w:p>
-        </w:tc>
-        <w:tc>
-          <w:tcPr>
-            <w:tcW w:type="dxa" w:w="3744"/>
-            <w:shd w:fill="F8FAFC"/>
-            <w:tcMar>
-              <w:top w:w="100" w:type="dxa"/>
-              <w:bottom w:w="100" w:type="dxa"/>
-              <w:left w:w="140" w:type="dxa"/>
-              <w:right w:w="140" w:type="dxa"/>
-            </w:tcMar>
-            <w:tcBorders>
-              <w:top w:val="single" w:sz="4" w:space="0" w:color="E2E8F0"/>
-              <w:left w:val="single" w:sz="4" w:space="0" w:color="E2E8F0"/>
-              <w:bottom w:val="single" w:sz="4" w:space="0" w:color="E2E8F0"/>
-              <w:right w:val="single" w:sz="4" w:space="0" w:color="E2E8F0"/>
-            </w:tcBorders>
-          </w:tcPr>
-          <w:p>
-            <w:pPr>
-              <w:spacing w:before="40" w:after="40"/>
-              <w:jc w:val="left"/>
-            </w:pPr>
-            <w:r>
-              <w:rPr>
-                <w:rFonts w:ascii="Calibri" w:hAnsi="Calibri"/>
-                <w:color w:val="1E293B"/>
-                <w:sz w:val="19"/>
-              </w:rPr>
-              <w:t>English</w:t>
-            </w:r>
-          </w:p>
-        </w:tc>
-        <w:tc>
-          <w:tcPr>
-            <w:tcW w:type="dxa" w:w="5184"/>
-            <w:shd w:fill="F8FAFC"/>
-            <w:tcMar>
-              <w:top w:w="100" w:type="dxa"/>
-              <w:bottom w:w="100" w:type="dxa"/>
-              <w:left w:w="140" w:type="dxa"/>
-              <w:right w:w="140" w:type="dxa"/>
-            </w:tcMar>
-            <w:tcBorders>
-              <w:top w:val="single" w:sz="4" w:space="0" w:color="E2E8F0"/>
-              <w:left w:val="single" w:sz="4" w:space="0" w:color="E2E8F0"/>
-              <w:bottom w:val="single" w:sz="4" w:space="0" w:color="E2E8F0"/>
-              <w:right w:val="single" w:sz="4" w:space="0" w:color="E2E8F0"/>
-            </w:tcBorders>
-          </w:tcPr>
-          <w:p>
-            <w:pPr>
-              <w:spacing w:before="40" w:after="40"/>
-              <w:jc w:val="left"/>
-            </w:pPr>
-            <w:r>
-              <w:rPr>
-                <w:rFonts w:ascii="Calibri" w:hAnsi="Calibri"/>
-                <w:color w:val="1E293B"/>
-                <w:sz w:val="19"/>
-              </w:rPr>
-              <w:t>English communication and foundational language</w:t>
-            </w:r>
-          </w:p>
-        </w:tc>
-      </w:tr>
-      <w:tr>
-        <w:tc>
-          <w:tcPr>
-            <w:tcW w:type="dxa" w:w="864"/>
-            <w:shd w:fill="FFFFFF"/>
-            <w:tcMar>
-              <w:top w:w="100" w:type="dxa"/>
-              <w:bottom w:w="100" w:type="dxa"/>
-              <w:left w:w="140" w:type="dxa"/>
-              <w:right w:w="140" w:type="dxa"/>
-            </w:tcMar>
-            <w:tcBorders>
-              <w:top w:val="single" w:sz="4" w:space="0" w:color="E2E8F0"/>
-              <w:left w:val="single" w:sz="4" w:space="0" w:color="E2E8F0"/>
-              <w:bottom w:val="single" w:sz="4" w:space="0" w:color="E2E8F0"/>
-              <w:right w:val="single" w:sz="4" w:space="0" w:color="E2E8F0"/>
-            </w:tcBorders>
-          </w:tcPr>
-          <w:p>
-            <w:pPr>
-              <w:spacing w:before="40" w:after="40"/>
-              <w:jc w:val="left"/>
-            </w:pPr>
-            <w:r>
-              <w:rPr>
-                <w:rFonts w:ascii="Calibri" w:hAnsi="Calibri"/>
-                <w:color w:val="1E293B"/>
-                <w:sz w:val="19"/>
-              </w:rPr>
-              <w:t>7</w:t>
-            </w:r>
-          </w:p>
-        </w:tc>
-        <w:tc>
-          <w:tcPr>
-            <w:tcW w:type="dxa" w:w="3744"/>
-            <w:shd w:fill="FFFFFF"/>
-            <w:tcMar>
-              <w:top w:w="100" w:type="dxa"/>
-              <w:bottom w:w="100" w:type="dxa"/>
-              <w:left w:w="140" w:type="dxa"/>
-              <w:right w:w="140" w:type="dxa"/>
-            </w:tcMar>
-            <w:tcBorders>
-              <w:top w:val="single" w:sz="4" w:space="0" w:color="E2E8F0"/>
-              <w:left w:val="single" w:sz="4" w:space="0" w:color="E2E8F0"/>
-              <w:bottom w:val="single" w:sz="4" w:space="0" w:color="E2E8F0"/>
-              <w:right w:val="single" w:sz="4" w:space="0" w:color="E2E8F0"/>
-            </w:tcBorders>
-          </w:tcPr>
-          <w:p>
-            <w:pPr>
-              <w:spacing w:before="40" w:after="40"/>
-              <w:jc w:val="left"/>
-            </w:pPr>
-            <w:r>
-              <w:rPr>
-                <w:rFonts w:ascii="Calibri" w:hAnsi="Calibri"/>
-                <w:color w:val="1E293B"/>
-                <w:sz w:val="19"/>
-              </w:rPr>
-              <w:t>English / Communication</w:t>
-            </w:r>
-          </w:p>
-        </w:tc>
-        <w:tc>
-          <w:tcPr>
-            <w:tcW w:type="dxa" w:w="5184"/>
-            <w:shd w:fill="FFFFFF"/>
-            <w:tcMar>
-              <w:top w:w="100" w:type="dxa"/>
-              <w:bottom w:w="100" w:type="dxa"/>
-              <w:left w:w="140" w:type="dxa"/>
-              <w:right w:w="140" w:type="dxa"/>
-            </w:tcMar>
-            <w:tcBorders>
-              <w:top w:val="single" w:sz="4" w:space="0" w:color="E2E8F0"/>
-              <w:left w:val="single" w:sz="4" w:space="0" w:color="E2E8F0"/>
-              <w:bottom w:val="single" w:sz="4" w:space="0" w:color="E2E8F0"/>
-              <w:right w:val="single" w:sz="4" w:space="0" w:color="E2E8F0"/>
-            </w:tcBorders>
-          </w:tcPr>
-          <w:p>
-            <w:pPr>
-              <w:spacing w:before="40" w:after="40"/>
-              <w:jc w:val="left"/>
-            </w:pPr>
-            <w:r>
-              <w:rPr>
-                <w:rFonts w:ascii="Calibri" w:hAnsi="Calibri"/>
-                <w:color w:val="1E293B"/>
-                <w:sz w:val="19"/>
-              </w:rPr>
-              <w:t>Department of English / Communication &amp; Soft Skills</w:t>
-            </w:r>
-          </w:p>
-        </w:tc>
-      </w:tr>
-      <w:tr>
-        <w:tc>
-          <w:tcPr>
-            <w:tcW w:type="dxa" w:w="864"/>
-            <w:shd w:fill="F8FAFC"/>
-            <w:tcMar>
-              <w:top w:w="100" w:type="dxa"/>
-              <w:bottom w:w="100" w:type="dxa"/>
-              <w:left w:w="140" w:type="dxa"/>
-              <w:right w:w="140" w:type="dxa"/>
-            </w:tcMar>
-            <w:tcBorders>
-              <w:top w:val="single" w:sz="4" w:space="0" w:color="E2E8F0"/>
-              <w:left w:val="single" w:sz="4" w:space="0" w:color="E2E8F0"/>
-              <w:bottom w:val="single" w:sz="4" w:space="0" w:color="E2E8F0"/>
-              <w:right w:val="single" w:sz="4" w:space="0" w:color="E2E8F0"/>
-            </w:tcBorders>
-          </w:tcPr>
-          <w:p>
-            <w:pPr>
-              <w:spacing w:before="40" w:after="40"/>
-              <w:jc w:val="left"/>
-            </w:pPr>
-            <w:r>
-              <w:rPr>
-                <w:rFonts w:ascii="Calibri" w:hAnsi="Calibri"/>
-                <w:color w:val="1E293B"/>
-                <w:sz w:val="19"/>
-              </w:rPr>
-              <w:t>8</w:t>
-            </w:r>
-          </w:p>
-        </w:tc>
-        <w:tc>
-          <w:tcPr>
-            <w:tcW w:type="dxa" w:w="3744"/>
-            <w:shd w:fill="F8FAFC"/>
-            <w:tcMar>
-              <w:top w:w="100" w:type="dxa"/>
-              <w:bottom w:w="100" w:type="dxa"/>
-              <w:left w:w="140" w:type="dxa"/>
-              <w:right w:w="140" w:type="dxa"/>
-            </w:tcMar>
-            <w:tcBorders>
-              <w:top w:val="single" w:sz="4" w:space="0" w:color="E2E8F0"/>
-              <w:left w:val="single" w:sz="4" w:space="0" w:color="E2E8F0"/>
-              <w:bottom w:val="single" w:sz="4" w:space="0" w:color="E2E8F0"/>
-              <w:right w:val="single" w:sz="4" w:space="0" w:color="E2E8F0"/>
-            </w:tcBorders>
-          </w:tcPr>
-          <w:p>
-            <w:pPr>
-              <w:spacing w:before="40" w:after="40"/>
-              <w:jc w:val="left"/>
-            </w:pPr>
-            <w:r>
-              <w:rPr>
-                <w:rFonts w:ascii="Calibri" w:hAnsi="Calibri"/>
-                <w:color w:val="1E293B"/>
-                <w:sz w:val="19"/>
-              </w:rPr>
-              <w:t>Fashion Management</w:t>
-            </w:r>
-          </w:p>
-        </w:tc>
-        <w:tc>
-          <w:tcPr>
-            <w:tcW w:type="dxa" w:w="5184"/>
-            <w:shd w:fill="F8FAFC"/>
-            <w:tcMar>
-              <w:top w:w="100" w:type="dxa"/>
-              <w:bottom w:w="100" w:type="dxa"/>
-              <w:left w:w="140" w:type="dxa"/>
-              <w:right w:w="140" w:type="dxa"/>
-            </w:tcMar>
-            <w:tcBorders>
-              <w:top w:val="single" w:sz="4" w:space="0" w:color="E2E8F0"/>
-              <w:left w:val="single" w:sz="4" w:space="0" w:color="E2E8F0"/>
-              <w:bottom w:val="single" w:sz="4" w:space="0" w:color="E2E8F0"/>
-              <w:right w:val="single" w:sz="4" w:space="0" w:color="E2E8F0"/>
-            </w:tcBorders>
-          </w:tcPr>
-          <w:p>
-            <w:pPr>
-              <w:spacing w:before="40" w:after="40"/>
-              <w:jc w:val="left"/>
-            </w:pPr>
-            <w:r>
-              <w:rPr>
-                <w:rFonts w:ascii="Calibri" w:hAnsi="Calibri"/>
-                <w:color w:val="1E293B"/>
-                <w:sz w:val="19"/>
-              </w:rPr>
-              <w:t>Department of Fashion Management and Design</w:t>
-            </w:r>
-          </w:p>
-        </w:tc>
-      </w:tr>
-      <w:tr>
-        <w:tc>
-          <w:tcPr>
-            <w:tcW w:type="dxa" w:w="864"/>
-            <w:shd w:fill="FFFFFF"/>
-            <w:tcMar>
-              <w:top w:w="100" w:type="dxa"/>
-              <w:bottom w:w="100" w:type="dxa"/>
-              <w:left w:w="140" w:type="dxa"/>
-              <w:right w:w="140" w:type="dxa"/>
-            </w:tcMar>
-            <w:tcBorders>
-              <w:top w:val="single" w:sz="4" w:space="0" w:color="E2E8F0"/>
-              <w:left w:val="single" w:sz="4" w:space="0" w:color="E2E8F0"/>
-              <w:bottom w:val="single" w:sz="4" w:space="0" w:color="E2E8F0"/>
-              <w:right w:val="single" w:sz="4" w:space="0" w:color="E2E8F0"/>
-            </w:tcBorders>
-          </w:tcPr>
-          <w:p>
-            <w:pPr>
-              <w:spacing w:before="40" w:after="40"/>
-              <w:jc w:val="left"/>
-            </w:pPr>
-            <w:r>
-              <w:rPr>
-                <w:rFonts w:ascii="Calibri" w:hAnsi="Calibri"/>
-                <w:color w:val="1E293B"/>
-                <w:sz w:val="19"/>
-              </w:rPr>
-              <w:t>9</w:t>
-            </w:r>
-          </w:p>
-        </w:tc>
-        <w:tc>
-          <w:tcPr>
-            <w:tcW w:type="dxa" w:w="3744"/>
-            <w:shd w:fill="FFFFFF"/>
-            <w:tcMar>
-              <w:top w:w="100" w:type="dxa"/>
-              <w:bottom w:w="100" w:type="dxa"/>
-              <w:left w:w="140" w:type="dxa"/>
-              <w:right w:w="140" w:type="dxa"/>
-            </w:tcMar>
-            <w:tcBorders>
-              <w:top w:val="single" w:sz="4" w:space="0" w:color="E2E8F0"/>
-              <w:left w:val="single" w:sz="4" w:space="0" w:color="E2E8F0"/>
-              <w:bottom w:val="single" w:sz="4" w:space="0" w:color="E2E8F0"/>
-              <w:right w:val="single" w:sz="4" w:space="0" w:color="E2E8F0"/>
-            </w:tcBorders>
-          </w:tcPr>
-          <w:p>
-            <w:pPr>
-              <w:spacing w:before="40" w:after="40"/>
-              <w:jc w:val="left"/>
-            </w:pPr>
-            <w:r>
-              <w:rPr>
-                <w:rFonts w:ascii="Calibri" w:hAnsi="Calibri"/>
-                <w:color w:val="1E293B"/>
-                <w:sz w:val="19"/>
-              </w:rPr>
-              <w:t>General</w:t>
-            </w:r>
-          </w:p>
-        </w:tc>
-        <w:tc>
-          <w:tcPr>
-            <w:tcW w:type="dxa" w:w="5184"/>
-            <w:shd w:fill="FFFFFF"/>
-            <w:tcMar>
-              <w:top w:w="100" w:type="dxa"/>
-              <w:bottom w:w="100" w:type="dxa"/>
-              <w:left w:w="140" w:type="dxa"/>
-              <w:right w:w="140" w:type="dxa"/>
-            </w:tcMar>
-            <w:tcBorders>
-              <w:top w:val="single" w:sz="4" w:space="0" w:color="E2E8F0"/>
-              <w:left w:val="single" w:sz="4" w:space="0" w:color="E2E8F0"/>
-              <w:bottom w:val="single" w:sz="4" w:space="0" w:color="E2E8F0"/>
-              <w:right w:val="single" w:sz="4" w:space="0" w:color="E2E8F0"/>
-            </w:tcBorders>
-          </w:tcPr>
-          <w:p>
-            <w:pPr>
-              <w:spacing w:before="40" w:after="40"/>
-              <w:jc w:val="left"/>
-            </w:pPr>
-            <w:r>
-              <w:rPr>
-                <w:rFonts w:ascii="Calibri" w:hAnsi="Calibri"/>
-                <w:color w:val="1E293B"/>
-                <w:sz w:val="19"/>
-              </w:rPr>
-              <w:t>Miscellaneous or general stream curriculum</w:t>
-            </w:r>
-          </w:p>
-        </w:tc>
-      </w:tr>
-      <w:tr>
-        <w:tc>
-          <w:tcPr>
-            <w:tcW w:type="dxa" w:w="864"/>
-            <w:shd w:fill="F8FAFC"/>
-            <w:tcMar>
-              <w:top w:w="100" w:type="dxa"/>
-              <w:bottom w:w="100" w:type="dxa"/>
-              <w:left w:w="140" w:type="dxa"/>
-              <w:right w:w="140" w:type="dxa"/>
-            </w:tcMar>
-            <w:tcBorders>
-              <w:top w:val="single" w:sz="4" w:space="0" w:color="E2E8F0"/>
-              <w:left w:val="single" w:sz="4" w:space="0" w:color="E2E8F0"/>
-              <w:bottom w:val="single" w:sz="4" w:space="0" w:color="E2E8F0"/>
-              <w:right w:val="single" w:sz="4" w:space="0" w:color="E2E8F0"/>
-            </w:tcBorders>
-          </w:tcPr>
-          <w:p>
-            <w:pPr>
-              <w:spacing w:before="40" w:after="40"/>
-              <w:jc w:val="left"/>
-            </w:pPr>
-            <w:r>
-              <w:rPr>
-                <w:rFonts w:ascii="Calibri" w:hAnsi="Calibri"/>
-                <w:color w:val="1E293B"/>
-                <w:sz w:val="19"/>
-              </w:rPr>
-              <w:t>10</w:t>
-            </w:r>
-          </w:p>
-        </w:tc>
-        <w:tc>
-          <w:tcPr>
-            <w:tcW w:type="dxa" w:w="3744"/>
-            <w:shd w:fill="F8FAFC"/>
-            <w:tcMar>
-              <w:top w:w="100" w:type="dxa"/>
-              <w:bottom w:w="100" w:type="dxa"/>
-              <w:left w:w="140" w:type="dxa"/>
-              <w:right w:w="140" w:type="dxa"/>
-            </w:tcMar>
-            <w:tcBorders>
-              <w:top w:val="single" w:sz="4" w:space="0" w:color="E2E8F0"/>
-              <w:left w:val="single" w:sz="4" w:space="0" w:color="E2E8F0"/>
-              <w:bottom w:val="single" w:sz="4" w:space="0" w:color="E2E8F0"/>
-              <w:right w:val="single" w:sz="4" w:space="0" w:color="E2E8F0"/>
-            </w:tcBorders>
-          </w:tcPr>
-          <w:p>
-            <w:pPr>
-              <w:spacing w:before="40" w:after="40"/>
-              <w:jc w:val="left"/>
-            </w:pPr>
-            <w:r>
-              <w:rPr>
-                <w:rFonts w:ascii="Calibri" w:hAnsi="Calibri"/>
-                <w:color w:val="1E293B"/>
-                <w:sz w:val="19"/>
-              </w:rPr>
-              <w:t>Management</w:t>
-            </w:r>
-          </w:p>
-        </w:tc>
-        <w:tc>
-          <w:tcPr>
-            <w:tcW w:type="dxa" w:w="5184"/>
-            <w:shd w:fill="F8FAFC"/>
-            <w:tcMar>
-              <w:top w:w="100" w:type="dxa"/>
-              <w:bottom w:w="100" w:type="dxa"/>
-              <w:left w:w="140" w:type="dxa"/>
-              <w:right w:w="140" w:type="dxa"/>
-            </w:tcMar>
-            <w:tcBorders>
-              <w:top w:val="single" w:sz="4" w:space="0" w:color="E2E8F0"/>
-              <w:left w:val="single" w:sz="4" w:space="0" w:color="E2E8F0"/>
-              <w:bottom w:val="single" w:sz="4" w:space="0" w:color="E2E8F0"/>
-              <w:right w:val="single" w:sz="4" w:space="0" w:color="E2E8F0"/>
-            </w:tcBorders>
-          </w:tcPr>
-          <w:p>
-            <w:pPr>
-              <w:spacing w:before="40" w:after="40"/>
-              <w:jc w:val="left"/>
-            </w:pPr>
-            <w:r>
-              <w:rPr>
-                <w:rFonts w:ascii="Calibri" w:hAnsi="Calibri"/>
-                <w:color w:val="1E293B"/>
-                <w:sz w:val="19"/>
-              </w:rPr>
-              <w:t>Management &amp; Business administration courses</w:t>
-            </w:r>
-          </w:p>
-        </w:tc>
-      </w:tr>
-      <w:tr>
-        <w:tc>
-          <w:tcPr>
-            <w:tcW w:type="dxa" w:w="864"/>
-            <w:shd w:fill="FFFFFF"/>
-            <w:tcMar>
-              <w:top w:w="100" w:type="dxa"/>
-              <w:bottom w:w="100" w:type="dxa"/>
-              <w:left w:w="140" w:type="dxa"/>
-              <w:right w:w="140" w:type="dxa"/>
-            </w:tcMar>
-            <w:tcBorders>
-              <w:top w:val="single" w:sz="4" w:space="0" w:color="E2E8F0"/>
-              <w:left w:val="single" w:sz="4" w:space="0" w:color="E2E8F0"/>
-              <w:bottom w:val="single" w:sz="4" w:space="0" w:color="E2E8F0"/>
-              <w:right w:val="single" w:sz="4" w:space="0" w:color="E2E8F0"/>
-            </w:tcBorders>
-          </w:tcPr>
-          <w:p>
-            <w:pPr>
-              <w:spacing w:before="40" w:after="40"/>
-              <w:jc w:val="left"/>
-            </w:pPr>
-            <w:r>
-              <w:rPr>
-                <w:rFonts w:ascii="Calibri" w:hAnsi="Calibri"/>
-                <w:color w:val="1E293B"/>
-                <w:sz w:val="19"/>
-              </w:rPr>
-              <w:t>11</w:t>
-            </w:r>
-          </w:p>
-        </w:tc>
-        <w:tc>
-          <w:tcPr>
-            <w:tcW w:type="dxa" w:w="3744"/>
-            <w:shd w:fill="FFFFFF"/>
-            <w:tcMar>
-              <w:top w:w="100" w:type="dxa"/>
-              <w:bottom w:w="100" w:type="dxa"/>
-              <w:left w:w="140" w:type="dxa"/>
-              <w:right w:w="140" w:type="dxa"/>
-            </w:tcMar>
-            <w:tcBorders>
-              <w:top w:val="single" w:sz="4" w:space="0" w:color="E2E8F0"/>
-              <w:left w:val="single" w:sz="4" w:space="0" w:color="E2E8F0"/>
-              <w:bottom w:val="single" w:sz="4" w:space="0" w:color="E2E8F0"/>
-              <w:right w:val="single" w:sz="4" w:space="0" w:color="E2E8F0"/>
-            </w:tcBorders>
-          </w:tcPr>
-          <w:p>
-            <w:pPr>
-              <w:spacing w:before="40" w:after="40"/>
-              <w:jc w:val="left"/>
-            </w:pPr>
-            <w:r>
-              <w:rPr>
-                <w:rFonts w:ascii="Calibri" w:hAnsi="Calibri"/>
-                <w:color w:val="1E293B"/>
-                <w:sz w:val="19"/>
-              </w:rPr>
-              <w:t>Mathematics</w:t>
-            </w:r>
-          </w:p>
-        </w:tc>
-        <w:tc>
-          <w:tcPr>
-            <w:tcW w:type="dxa" w:w="5184"/>
-            <w:shd w:fill="FFFFFF"/>
-            <w:tcMar>
-              <w:top w:w="100" w:type="dxa"/>
-              <w:bottom w:w="100" w:type="dxa"/>
-              <w:left w:w="140" w:type="dxa"/>
-              <w:right w:w="140" w:type="dxa"/>
-            </w:tcMar>
-            <w:tcBorders>
-              <w:top w:val="single" w:sz="4" w:space="0" w:color="E2E8F0"/>
-              <w:left w:val="single" w:sz="4" w:space="0" w:color="E2E8F0"/>
-              <w:bottom w:val="single" w:sz="4" w:space="0" w:color="E2E8F0"/>
-              <w:right w:val="single" w:sz="4" w:space="0" w:color="E2E8F0"/>
-            </w:tcBorders>
-          </w:tcPr>
-          <w:p>
-            <w:pPr>
-              <w:spacing w:before="40" w:after="40"/>
-              <w:jc w:val="left"/>
-            </w:pPr>
-            <w:r>
-              <w:rPr>
-                <w:rFonts w:ascii="Calibri" w:hAnsi="Calibri"/>
-                <w:color w:val="1E293B"/>
-                <w:sz w:val="19"/>
-              </w:rPr>
-              <w:t>Mathematics &amp; Statistics</w:t>
-            </w:r>
-          </w:p>
-        </w:tc>
-      </w:tr>
-      <w:tr>
-        <w:tc>
-          <w:tcPr>
-            <w:tcW w:type="dxa" w:w="864"/>
-            <w:shd w:fill="F8FAFC"/>
-            <w:tcMar>
-              <w:top w:w="100" w:type="dxa"/>
-              <w:bottom w:w="100" w:type="dxa"/>
-              <w:left w:w="140" w:type="dxa"/>
-              <w:right w:w="140" w:type="dxa"/>
-            </w:tcMar>
-            <w:tcBorders>
-              <w:top w:val="single" w:sz="4" w:space="0" w:color="E2E8F0"/>
-              <w:left w:val="single" w:sz="4" w:space="0" w:color="E2E8F0"/>
-              <w:bottom w:val="single" w:sz="4" w:space="0" w:color="E2E8F0"/>
-              <w:right w:val="single" w:sz="4" w:space="0" w:color="E2E8F0"/>
-            </w:tcBorders>
-          </w:tcPr>
-          <w:p>
-            <w:pPr>
-              <w:spacing w:before="40" w:after="40"/>
-              <w:jc w:val="left"/>
-            </w:pPr>
-            <w:r>
-              <w:rPr>
-                <w:rFonts w:ascii="Calibri" w:hAnsi="Calibri"/>
-                <w:color w:val="1E293B"/>
-                <w:sz w:val="19"/>
-              </w:rPr>
-              <w:t>12</w:t>
-            </w:r>
-          </w:p>
-        </w:tc>
-        <w:tc>
-          <w:tcPr>
-            <w:tcW w:type="dxa" w:w="3744"/>
-            <w:shd w:fill="F8FAFC"/>
-            <w:tcMar>
-              <w:top w:w="100" w:type="dxa"/>
-              <w:bottom w:w="100" w:type="dxa"/>
-              <w:left w:w="140" w:type="dxa"/>
-              <w:right w:w="140" w:type="dxa"/>
-            </w:tcMar>
-            <w:tcBorders>
-              <w:top w:val="single" w:sz="4" w:space="0" w:color="E2E8F0"/>
-              <w:left w:val="single" w:sz="4" w:space="0" w:color="E2E8F0"/>
-              <w:bottom w:val="single" w:sz="4" w:space="0" w:color="E2E8F0"/>
-              <w:right w:val="single" w:sz="4" w:space="0" w:color="E2E8F0"/>
-            </w:tcBorders>
-          </w:tcPr>
-          <w:p>
-            <w:pPr>
-              <w:spacing w:before="40" w:after="40"/>
-              <w:jc w:val="left"/>
-            </w:pPr>
-            <w:r>
-              <w:rPr>
-                <w:rFonts w:ascii="Calibri" w:hAnsi="Calibri"/>
-                <w:color w:val="1E293B"/>
-                <w:sz w:val="19"/>
-              </w:rPr>
-              <w:t>Maths / Aptitude</w:t>
-            </w:r>
-          </w:p>
-        </w:tc>
-        <w:tc>
-          <w:tcPr>
-            <w:tcW w:type="dxa" w:w="5184"/>
-            <w:shd w:fill="F8FAFC"/>
-            <w:tcMar>
-              <w:top w:w="100" w:type="dxa"/>
-              <w:bottom w:w="100" w:type="dxa"/>
-              <w:left w:w="140" w:type="dxa"/>
-              <w:right w:w="140" w:type="dxa"/>
-            </w:tcMar>
-            <w:tcBorders>
-              <w:top w:val="single" w:sz="4" w:space="0" w:color="E2E8F0"/>
-              <w:left w:val="single" w:sz="4" w:space="0" w:color="E2E8F0"/>
-              <w:bottom w:val="single" w:sz="4" w:space="0" w:color="E2E8F0"/>
-              <w:right w:val="single" w:sz="4" w:space="0" w:color="E2E8F0"/>
-            </w:tcBorders>
-          </w:tcPr>
-          <w:p>
-            <w:pPr>
-              <w:spacing w:before="40" w:after="40"/>
-              <w:jc w:val="left"/>
-            </w:pPr>
-            <w:r>
-              <w:rPr>
-                <w:rFonts w:ascii="Calibri" w:hAnsi="Calibri"/>
-                <w:color w:val="1E293B"/>
-                <w:sz w:val="19"/>
-              </w:rPr>
-              <w:t>Department of Maths, quantitative training &amp; Aptitude</w:t>
-            </w:r>
-          </w:p>
-        </w:tc>
-      </w:tr>
-      <w:tr>
-        <w:tc>
-          <w:tcPr>
-            <w:tcW w:type="dxa" w:w="864"/>
-            <w:shd w:fill="FFFFFF"/>
-            <w:tcMar>
-              <w:top w:w="100" w:type="dxa"/>
-              <w:bottom w:w="100" w:type="dxa"/>
-              <w:left w:w="140" w:type="dxa"/>
-              <w:right w:w="140" w:type="dxa"/>
-            </w:tcMar>
-            <w:tcBorders>
-              <w:top w:val="single" w:sz="4" w:space="0" w:color="E2E8F0"/>
-              <w:left w:val="single" w:sz="4" w:space="0" w:color="E2E8F0"/>
-              <w:bottom w:val="single" w:sz="4" w:space="0" w:color="E2E8F0"/>
-              <w:right w:val="single" w:sz="4" w:space="0" w:color="E2E8F0"/>
-            </w:tcBorders>
-          </w:tcPr>
-          <w:p>
-            <w:pPr>
-              <w:spacing w:before="40" w:after="40"/>
-              <w:jc w:val="left"/>
-            </w:pPr>
-            <w:r>
-              <w:rPr>
-                <w:rFonts w:ascii="Calibri" w:hAnsi="Calibri"/>
-                <w:color w:val="1E293B"/>
-                <w:sz w:val="19"/>
-              </w:rPr>
-              <w:t>13</w:t>
-            </w:r>
-          </w:p>
-        </w:tc>
-        <w:tc>
-          <w:tcPr>
-            <w:tcW w:type="dxa" w:w="3744"/>
-            <w:shd w:fill="FFFFFF"/>
-            <w:tcMar>
-              <w:top w:w="100" w:type="dxa"/>
-              <w:bottom w:w="100" w:type="dxa"/>
-              <w:left w:w="140" w:type="dxa"/>
-              <w:right w:w="140" w:type="dxa"/>
-            </w:tcMar>
-            <w:tcBorders>
-              <w:top w:val="single" w:sz="4" w:space="0" w:color="E2E8F0"/>
-              <w:left w:val="single" w:sz="4" w:space="0" w:color="E2E8F0"/>
-              <w:bottom w:val="single" w:sz="4" w:space="0" w:color="E2E8F0"/>
-              <w:right w:val="single" w:sz="4" w:space="0" w:color="E2E8F0"/>
-            </w:tcBorders>
-          </w:tcPr>
-          <w:p>
-            <w:pPr>
-              <w:spacing w:before="40" w:after="40"/>
-              <w:jc w:val="left"/>
-            </w:pPr>
-            <w:r>
-              <w:rPr>
-                <w:rFonts w:ascii="Calibri" w:hAnsi="Calibri"/>
-                <w:color w:val="1E293B"/>
-                <w:sz w:val="19"/>
-              </w:rPr>
-              <w:t>Soft Skills</w:t>
-            </w:r>
-          </w:p>
-        </w:tc>
-        <w:tc>
-          <w:tcPr>
-            <w:tcW w:type="dxa" w:w="5184"/>
-            <w:shd w:fill="FFFFFF"/>
-            <w:tcMar>
-              <w:top w:w="100" w:type="dxa"/>
-              <w:bottom w:w="100" w:type="dxa"/>
-              <w:left w:w="140" w:type="dxa"/>
-              <w:right w:w="140" w:type="dxa"/>
-            </w:tcMar>
-            <w:tcBorders>
-              <w:top w:val="single" w:sz="4" w:space="0" w:color="E2E8F0"/>
-              <w:left w:val="single" w:sz="4" w:space="0" w:color="E2E8F0"/>
-              <w:bottom w:val="single" w:sz="4" w:space="0" w:color="E2E8F0"/>
-              <w:right w:val="single" w:sz="4" w:space="0" w:color="E2E8F0"/>
-            </w:tcBorders>
-          </w:tcPr>
-          <w:p>
-            <w:pPr>
-              <w:spacing w:before="40" w:after="40"/>
-              <w:jc w:val="left"/>
-            </w:pPr>
-            <w:r>
-              <w:rPr>
-                <w:rFonts w:ascii="Calibri" w:hAnsi="Calibri"/>
-                <w:color w:val="1E293B"/>
-                <w:sz w:val="19"/>
-              </w:rPr>
-              <w:t>Presentation skills, resume building, and interview prep</w:t>
-            </w:r>
-          </w:p>
-        </w:tc>
-      </w:tr>
-      <w:tr>
-        <w:tc>
-          <w:tcPr>
-            <w:tcW w:type="dxa" w:w="864"/>
-            <w:shd w:fill="F8FAFC"/>
-            <w:tcMar>
-              <w:top w:w="100" w:type="dxa"/>
-              <w:bottom w:w="100" w:type="dxa"/>
-              <w:left w:w="140" w:type="dxa"/>
-              <w:right w:w="140" w:type="dxa"/>
-            </w:tcMar>
-            <w:tcBorders>
-              <w:top w:val="single" w:sz="4" w:space="0" w:color="E2E8F0"/>
-              <w:left w:val="single" w:sz="4" w:space="0" w:color="E2E8F0"/>
-              <w:bottom w:val="single" w:sz="4" w:space="0" w:color="E2E8F0"/>
-              <w:right w:val="single" w:sz="4" w:space="0" w:color="E2E8F0"/>
-            </w:tcBorders>
-          </w:tcPr>
-          <w:p>
-            <w:pPr>
-              <w:spacing w:before="40" w:after="40"/>
-              <w:jc w:val="left"/>
-            </w:pPr>
-            <w:r>
-              <w:rPr>
-                <w:rFonts w:ascii="Calibri" w:hAnsi="Calibri"/>
-                <w:color w:val="1E293B"/>
-                <w:sz w:val="19"/>
-              </w:rPr>
-              <w:t>14</w:t>
-            </w:r>
-          </w:p>
-        </w:tc>
-        <w:tc>
-          <w:tcPr>
-            <w:tcW w:type="dxa" w:w="3744"/>
-            <w:shd w:fill="F8FAFC"/>
-            <w:tcMar>
-              <w:top w:w="100" w:type="dxa"/>
-              <w:bottom w:w="100" w:type="dxa"/>
-              <w:left w:w="140" w:type="dxa"/>
-              <w:right w:w="140" w:type="dxa"/>
-            </w:tcMar>
-            <w:tcBorders>
-              <w:top w:val="single" w:sz="4" w:space="0" w:color="E2E8F0"/>
-              <w:left w:val="single" w:sz="4" w:space="0" w:color="E2E8F0"/>
-              <w:bottom w:val="single" w:sz="4" w:space="0" w:color="E2E8F0"/>
-              <w:right w:val="single" w:sz="4" w:space="0" w:color="E2E8F0"/>
-            </w:tcBorders>
-          </w:tcPr>
-          <w:p>
-            <w:pPr>
-              <w:spacing w:before="40" w:after="40"/>
-              <w:jc w:val="left"/>
-            </w:pPr>
-            <w:r>
-              <w:rPr>
-                <w:rFonts w:ascii="Calibri" w:hAnsi="Calibri"/>
-                <w:color w:val="1E293B"/>
-                <w:sz w:val="19"/>
-              </w:rPr>
-              <w:t>Tamil</w:t>
-            </w:r>
-          </w:p>
-        </w:tc>
-        <w:tc>
-          <w:tcPr>
-            <w:tcW w:type="dxa" w:w="5184"/>
-            <w:shd w:fill="F8FAFC"/>
-            <w:tcMar>
-              <w:top w:w="100" w:type="dxa"/>
-              <w:bottom w:w="100" w:type="dxa"/>
-              <w:left w:w="140" w:type="dxa"/>
-              <w:right w:w="140" w:type="dxa"/>
-            </w:tcMar>
-            <w:tcBorders>
-              <w:top w:val="single" w:sz="4" w:space="0" w:color="E2E8F0"/>
-              <w:left w:val="single" w:sz="4" w:space="0" w:color="E2E8F0"/>
-              <w:bottom w:val="single" w:sz="4" w:space="0" w:color="E2E8F0"/>
-              <w:right w:val="single" w:sz="4" w:space="0" w:color="E2E8F0"/>
-            </w:tcBorders>
-          </w:tcPr>
-          <w:p>
-            <w:pPr>
-              <w:spacing w:before="40" w:after="40"/>
-              <w:jc w:val="left"/>
-            </w:pPr>
-            <w:r>
-              <w:rPr>
-                <w:rFonts w:ascii="Calibri" w:hAnsi="Calibri"/>
-                <w:color w:val="1E293B"/>
-                <w:sz w:val="19"/>
-              </w:rPr>
-              <w:t>Tamil language, literature and cultural studies</w:t>
-            </w:r>
-          </w:p>
-        </w:tc>
-      </w:tr>
-      <w:tr>
-        <w:tc>
-          <w:tcPr>
-            <w:tcW w:type="dxa" w:w="864"/>
-            <w:shd w:fill="FFFFFF"/>
-            <w:tcMar>
-              <w:top w:w="100" w:type="dxa"/>
-              <w:bottom w:w="100" w:type="dxa"/>
-              <w:left w:w="140" w:type="dxa"/>
-              <w:right w:w="140" w:type="dxa"/>
-            </w:tcMar>
-            <w:tcBorders>
-              <w:top w:val="single" w:sz="4" w:space="0" w:color="E2E8F0"/>
-              <w:left w:val="single" w:sz="4" w:space="0" w:color="E2E8F0"/>
-              <w:bottom w:val="single" w:sz="4" w:space="0" w:color="E2E8F0"/>
-              <w:right w:val="single" w:sz="4" w:space="0" w:color="E2E8F0"/>
-            </w:tcBorders>
-          </w:tcPr>
-          <w:p>
-            <w:pPr>
-              <w:spacing w:before="40" w:after="40"/>
-              <w:jc w:val="left"/>
-            </w:pPr>
-            <w:r>
-              <w:rPr>
-                <w:rFonts w:ascii="Calibri" w:hAnsi="Calibri"/>
-                <w:color w:val="1E293B"/>
-                <w:sz w:val="19"/>
-              </w:rPr>
-              <w:t>15</w:t>
-            </w:r>
-          </w:p>
-        </w:tc>
-        <w:tc>
-          <w:tcPr>
-            <w:tcW w:type="dxa" w:w="3744"/>
-            <w:shd w:fill="FFFFFF"/>
-            <w:tcMar>
-              <w:top w:w="100" w:type="dxa"/>
-              <w:bottom w:w="100" w:type="dxa"/>
-              <w:left w:w="140" w:type="dxa"/>
-              <w:right w:w="140" w:type="dxa"/>
-            </w:tcMar>
-            <w:tcBorders>
-              <w:top w:val="single" w:sz="4" w:space="0" w:color="E2E8F0"/>
-              <w:left w:val="single" w:sz="4" w:space="0" w:color="E2E8F0"/>
-              <w:bottom w:val="single" w:sz="4" w:space="0" w:color="E2E8F0"/>
-              <w:right w:val="single" w:sz="4" w:space="0" w:color="E2E8F0"/>
-            </w:tcBorders>
-          </w:tcPr>
-          <w:p>
-            <w:pPr>
-              <w:spacing w:before="40" w:after="40"/>
-              <w:jc w:val="left"/>
-            </w:pPr>
-            <w:r>
-              <w:rPr>
-                <w:rFonts w:ascii="Calibri" w:hAnsi="Calibri"/>
-                <w:color w:val="1E293B"/>
-                <w:sz w:val="19"/>
-              </w:rPr>
-              <w:t>Technical</w:t>
-            </w:r>
-          </w:p>
-        </w:tc>
-        <w:tc>
-          <w:tcPr>
-            <w:tcW w:type="dxa" w:w="5184"/>
-            <w:shd w:fill="FFFFFF"/>
-            <w:tcMar>
-              <w:top w:w="100" w:type="dxa"/>
-              <w:bottom w:w="100" w:type="dxa"/>
-              <w:left w:w="140" w:type="dxa"/>
-              <w:right w:w="140" w:type="dxa"/>
-            </w:tcMar>
-            <w:tcBorders>
-              <w:top w:val="single" w:sz="4" w:space="0" w:color="E2E8F0"/>
-              <w:left w:val="single" w:sz="4" w:space="0" w:color="E2E8F0"/>
-              <w:bottom w:val="single" w:sz="4" w:space="0" w:color="E2E8F0"/>
-              <w:right w:val="single" w:sz="4" w:space="0" w:color="E2E8F0"/>
-            </w:tcBorders>
-          </w:tcPr>
-          <w:p>
-            <w:pPr>
-              <w:spacing w:before="40" w:after="40"/>
-              <w:jc w:val="left"/>
-            </w:pPr>
-            <w:r>
-              <w:rPr>
-                <w:rFonts w:ascii="Calibri" w:hAnsi="Calibri"/>
-                <w:color w:val="1E293B"/>
-                <w:sz w:val="19"/>
-              </w:rPr>
-              <w:t>Specialized programming, coding labs, and technical stacks</w:t>
+              <w:t>Both fixes are fully implemented, tested against both local and Supabase cloud databases, and committed to the repository.</w:t>
             </w:r>
           </w:p>
         </w:tc>
@@ -2922,143 +758,8 @@
     </w:tbl>
     <w:p>
       <w:pPr>
-        <w:spacing w:before="280" w:after="80"/>
+        <w:spacing w:after="80"/>
       </w:pPr>
-      <w:r>
-        <w:rPr>
-          <w:rFonts w:ascii="Calibri" w:hAnsi="Calibri"/>
-          <w:b/>
-          <w:color w:val="1E3A8A"/>
-          <w:sz w:val="28"/>
-        </w:rPr>
-        <w:t>6. Quick How-To Verification Guide</w:t>
-      </w:r>
-    </w:p>
-    <w:p>
-      <w:pPr>
-        <w:pStyle w:val="ListBullet"/>
-        <w:spacing w:before="20" w:after="40"/>
-      </w:pPr>
-      <w:r>
-        <w:rPr>
-          <w:rFonts w:ascii="Calibri" w:hAnsi="Calibri"/>
-          <w:b/>
-          <w:sz w:val="20"/>
-        </w:rPr>
-        <w:t xml:space="preserve">Step 1 (Faculty): </w:t>
-      </w:r>
-      <w:r>
-        <w:rPr>
-          <w:rFonts w:ascii="Calibri" w:hAnsi="Calibri"/>
-          <w:sz w:val="20"/>
-        </w:rPr>
-        <w:t>Click on an expired or locked class slot in the Faculty Timetable -&gt; Click 'Request CAM Approval to Mark Attendance'.</w:t>
-      </w:r>
-    </w:p>
-    <w:p>
-      <w:pPr>
-        <w:pStyle w:val="ListBullet"/>
-        <w:spacing w:before="20" w:after="40"/>
-      </w:pPr>
-      <w:r>
-        <w:rPr>
-          <w:rFonts w:ascii="Calibri" w:hAnsi="Calibri"/>
-          <w:b/>
-          <w:sz w:val="20"/>
-        </w:rPr>
-        <w:t xml:space="preserve">Step 2 (Faculty): </w:t>
-      </w:r>
-      <w:r>
-        <w:rPr>
-          <w:rFonts w:ascii="Calibri" w:hAnsi="Calibri"/>
-          <w:sz w:val="20"/>
-        </w:rPr>
-        <w:t>Enter the justification reason and click 'Submit Request to CAM'. The modal closes cleanly with a green success notification.</w:t>
-      </w:r>
-    </w:p>
-    <w:p>
-      <w:pPr>
-        <w:pStyle w:val="ListBullet"/>
-        <w:spacing w:before="20" w:after="40"/>
-      </w:pPr>
-      <w:r>
-        <w:rPr>
-          <w:rFonts w:ascii="Calibri" w:hAnsi="Calibri"/>
-          <w:b/>
-          <w:sz w:val="20"/>
-        </w:rPr>
-        <w:t xml:space="preserve">Step 3 (CAM): </w:t>
-      </w:r>
-      <w:r>
-        <w:rPr>
-          <w:rFonts w:ascii="Calibri" w:hAnsi="Calibri"/>
-          <w:sz w:val="20"/>
-        </w:rPr>
-        <w:t>Log in as Campus Manager -&gt; Navigate to the Handover/Requests tab -&gt; Locate the Late Attendance item marked with the alarm icon ⏰.</w:t>
-      </w:r>
-    </w:p>
-    <w:p>
-      <w:pPr>
-        <w:pStyle w:val="ListBullet"/>
-        <w:spacing w:before="20" w:after="40"/>
-      </w:pPr>
-      <w:r>
-        <w:rPr>
-          <w:rFonts w:ascii="Calibri" w:hAnsi="Calibri"/>
-          <w:b/>
-          <w:sz w:val="20"/>
-        </w:rPr>
-        <w:t xml:space="preserve">Step 4 (CAM): </w:t>
-      </w:r>
-      <w:r>
-        <w:rPr>
-          <w:rFonts w:ascii="Calibri" w:hAnsi="Calibri"/>
-          <w:sz w:val="20"/>
-        </w:rPr>
-        <w:t>Click 'Approve Permission'. The status updates to Approved.</w:t>
-      </w:r>
-    </w:p>
-    <w:p>
-      <w:pPr>
-        <w:pStyle w:val="ListBullet"/>
-        <w:spacing w:before="20" w:after="40"/>
-      </w:pPr>
-      <w:r>
-        <w:rPr>
-          <w:rFonts w:ascii="Calibri" w:hAnsi="Calibri"/>
-          <w:b/>
-          <w:sz w:val="20"/>
-        </w:rPr>
-        <w:t xml:space="preserve">Step 5 (Faculty): </w:t>
-      </w:r>
-      <w:r>
-        <w:rPr>
-          <w:rFonts w:ascii="Calibri" w:hAnsi="Calibri"/>
-          <w:sz w:val="20"/>
-        </w:rPr>
-        <w:t>The slot is now unlocked. The faculty member can immediately click into the session and record student attendance.</w:t>
-      </w:r>
-    </w:p>
-    <w:p>
-      <w:pPr>
-        <w:pStyle w:val="ListBullet"/>
-        <w:spacing w:before="20" w:after="40"/>
-      </w:pPr>
-      <w:r>
-        <w:rPr>
-          <w:rFonts w:ascii="Calibri" w:hAnsi="Calibri"/>
-          <w:b/>
-          <w:sz w:val="20"/>
-        </w:rPr>
-        <w:t xml:space="preserve">Step 6 (Subject Groups): </w:t>
-      </w:r>
-      <w:r>
-        <w:rPr>
-          <w:rFonts w:ascii="Calibri" w:hAnsi="Calibri"/>
-          <w:sz w:val="20"/>
-        </w:rPr>
-        <w:t>Open CAM Dashboard -&gt; Setup / Mentor Management -&gt; Edit any mentor -&gt; The 'Subject Group' dropdown lists all 15 categories seamlessly.</w:t>
-      </w:r>
     </w:p>
     <w:sectPr>
       <w:pgSz w:w="12240" w:h="15840"/>

</xml_diff>